<commit_message>
docs: refresh the Word copy of the report (delete rules included)
</commit_message>
<xml_diff>
--- a/docs/PROJECT_REPORT.docx
+++ b/docs/PROJECT_REPORT.docx
@@ -194,7 +194,7 @@
           <w:sz w:val="22"/>
           <w:szCs w:val="22"/>
         </w:rPr>
-        <w:pict w14:anchorId="6A643B9F">
+        <w:pict w14:anchorId="3CC84C74">
           <v:rect id="_x0000_i1025" style="width:0;height:1.5pt" o:hralign="center" o:hrstd="t" o:hr="t" fillcolor="#a0a0a0" stroked="f"/>
         </w:pict>
       </w:r>
@@ -1220,7 +1220,7 @@
           <w:szCs w:val="22"/>
         </w:rPr>
         <w:lastRenderedPageBreak/>
-        <w:pict w14:anchorId="22502106">
+        <w:pict w14:anchorId="6B29E457">
           <v:rect id="_x0000_i1026" style="width:0;height:1.5pt" o:hralign="center" o:hrstd="t" o:hr="t" fillcolor="#a0a0a0" stroked="f"/>
         </w:pict>
       </w:r>
@@ -1475,7 +1475,7 @@
           <w:sz w:val="22"/>
           <w:szCs w:val="22"/>
         </w:rPr>
-        <w:pict w14:anchorId="770FA9FC">
+        <w:pict w14:anchorId="4129D484">
           <v:rect id="_x0000_i1027" style="width:0;height:1.5pt" o:hralign="center" o:hrstd="t" o:hr="t" fillcolor="#a0a0a0" stroked="f"/>
         </w:pict>
       </w:r>
@@ -1978,7 +1978,7 @@
           <w:sz w:val="22"/>
           <w:szCs w:val="22"/>
         </w:rPr>
-        <w:pict w14:anchorId="2EF91B57">
+        <w:pict w14:anchorId="7CCAAFFB">
           <v:rect id="_x0000_i1028" style="width:0;height:1.5pt" o:hralign="center" o:hrstd="t" o:hr="t" fillcolor="#a0a0a0" stroked="f"/>
         </w:pict>
       </w:r>
@@ -2595,6 +2595,49 @@
           <w:sz w:val="22"/>
           <w:szCs w:val="22"/>
         </w:rPr>
+        <w:t xml:space="preserve">The worker can </w:t>
+      </w:r>
+      <w:r>
+        <w:rPr>
+          <w:rStyle w:val="Strong"/>
+          <w:rFonts w:ascii="Calibri" w:hAnsi="Calibri" w:cs="Calibri"/>
+          <w:color w:val="1A1A1A"/>
+          <w:sz w:val="22"/>
+          <w:szCs w:val="22"/>
+        </w:rPr>
+        <w:t>delete their own record while it is still pending</w:t>
+      </w:r>
+      <w:r>
+        <w:rPr>
+          <w:rFonts w:ascii="Calibri" w:hAnsi="Calibri" w:cs="Calibri"/>
+          <w:color w:val="1A1A1A"/>
+          <w:sz w:val="22"/>
+          <w:szCs w:val="22"/>
+        </w:rPr>
+        <w:t xml:space="preserve"> (before review), and cancel anything still queued for upload. Once a supervisor has reviewed a record it becomes part of the site history and only an administrator can remove it.</w:t>
+      </w:r>
+    </w:p>
+    <w:p>
+      <w:pPr>
+        <w:pStyle w:val="NormalWeb"/>
+        <w:numPr>
+          <w:ilvl w:val="0"/>
+          <w:numId w:val="3"/>
+        </w:numPr>
+        <w:rPr>
+          <w:rFonts w:ascii="Calibri" w:hAnsi="Calibri" w:cs="Calibri"/>
+          <w:color w:val="1A1A1A"/>
+          <w:sz w:val="22"/>
+          <w:szCs w:val="22"/>
+        </w:rPr>
+      </w:pPr>
+      <w:r>
+        <w:rPr>
+          <w:rFonts w:ascii="Calibri" w:hAnsi="Calibri" w:cs="Calibri"/>
+          <w:color w:val="1A1A1A"/>
+          <w:sz w:val="22"/>
+          <w:szCs w:val="22"/>
+        </w:rPr>
         <w:t>Notifications inbox when a record is approved or rejected.</w:t>
       </w:r>
     </w:p>
@@ -2748,28 +2791,31 @@
       </w:pPr>
       <w:r>
         <w:rPr>
-          <w:rFonts w:ascii="Calibri" w:eastAsia="Times New Roman" w:hAnsi="Calibri" w:cs="Calibri"/>
-          <w:color w:val="1A1A1A"/>
-          <w:sz w:val="22"/>
-          <w:szCs w:val="22"/>
-        </w:rPr>
-        <w:t>Hazard report export to PDF (</w:t>
-      </w:r>
-      <w:r>
-        <w:rPr>
-          <w:rStyle w:val="HTMLCode"/>
-          <w:color w:val="1A1A1A"/>
-        </w:rPr>
-        <w:t>/api/export</w:t>
-      </w:r>
-      <w:r>
-        <w:rPr>
-          <w:rFonts w:ascii="Calibri" w:eastAsia="Times New Roman" w:hAnsi="Calibri" w:cs="Calibri"/>
-          <w:color w:val="1A1A1A"/>
-          <w:sz w:val="22"/>
-          <w:szCs w:val="22"/>
-        </w:rPr>
-        <w:t xml:space="preserve"> route using pdfkit).</w:t>
+          <w:rStyle w:val="Strong"/>
+          <w:rFonts w:ascii="Calibri" w:eastAsia="Times New Roman" w:hAnsi="Calibri" w:cs="Calibri"/>
+          <w:color w:val="1A1A1A"/>
+          <w:sz w:val="22"/>
+          <w:szCs w:val="22"/>
+        </w:rPr>
+        <w:t>Delete records</w:t>
+      </w:r>
+      <w:r>
+        <w:rPr>
+          <w:rFonts w:ascii="Calibri" w:eastAsia="Times New Roman" w:hAnsi="Calibri" w:cs="Calibri"/>
+          <w:color w:val="1A1A1A"/>
+          <w:sz w:val="22"/>
+          <w:szCs w:val="22"/>
+        </w:rPr>
+        <w:t xml:space="preserve"> (administrators): permanently remove a record from the list or the record page, with a two-click confirmation; its photos and notifications are removed </w:t>
+      </w:r>
+      <w:r>
+        <w:rPr>
+          <w:rFonts w:ascii="Calibri" w:eastAsia="Times New Roman" w:hAnsi="Calibri" w:cs="Calibri"/>
+          <w:color w:val="1A1A1A"/>
+          <w:sz w:val="22"/>
+          <w:szCs w:val="22"/>
+        </w:rPr>
+        <w:t>with it.</w:t>
       </w:r>
     </w:p>
     <w:p>
@@ -2793,7 +2839,23 @@
           <w:sz w:val="22"/>
           <w:szCs w:val="22"/>
         </w:rPr>
-        <w:t>User management: create accounts, assign roles, deactivate / reactivate.</w:t>
+        <w:t>Hazard report export to PDF (</w:t>
+      </w:r>
+      <w:r>
+        <w:rPr>
+          <w:rStyle w:val="HTMLCode"/>
+          <w:color w:val="1A1A1A"/>
+        </w:rPr>
+        <w:t>/api/export</w:t>
+      </w:r>
+      <w:r>
+        <w:rPr>
+          <w:rFonts w:ascii="Calibri" w:eastAsia="Times New Roman" w:hAnsi="Calibri" w:cs="Calibri"/>
+          <w:color w:val="1A1A1A"/>
+          <w:sz w:val="22"/>
+          <w:szCs w:val="22"/>
+        </w:rPr>
+        <w:t xml:space="preserve"> route using pdfkit).</w:t>
       </w:r>
     </w:p>
     <w:p>
@@ -2817,6 +2879,30 @@
           <w:sz w:val="22"/>
           <w:szCs w:val="22"/>
         </w:rPr>
+        <w:t>User management: create accounts, assign roles, deactivate / reactivate.</w:t>
+      </w:r>
+    </w:p>
+    <w:p>
+      <w:pPr>
+        <w:numPr>
+          <w:ilvl w:val="0"/>
+          <w:numId w:val="4"/>
+        </w:numPr>
+        <w:spacing w:before="100" w:beforeAutospacing="1" w:after="100" w:afterAutospacing="1"/>
+        <w:rPr>
+          <w:rFonts w:ascii="Calibri" w:eastAsia="Times New Roman" w:hAnsi="Calibri" w:cs="Calibri"/>
+          <w:color w:val="1A1A1A"/>
+          <w:sz w:val="22"/>
+          <w:szCs w:val="22"/>
+        </w:rPr>
+      </w:pPr>
+      <w:r>
+        <w:rPr>
+          <w:rFonts w:ascii="Calibri" w:eastAsia="Times New Roman" w:hAnsi="Calibri" w:cs="Calibri"/>
+          <w:color w:val="1A1A1A"/>
+          <w:sz w:val="22"/>
+          <w:szCs w:val="22"/>
+        </w:rPr>
         <w:t>Zone management: create and edit the monitoring zones shown on the map.</w:t>
       </w:r>
     </w:p>
@@ -2855,6 +2941,7 @@
           <w:sz w:val="22"/>
           <w:szCs w:val="22"/>
         </w:rPr>
+        <w:lastRenderedPageBreak/>
         <w:t>PostgreSQL schema with 4 domain tables and 1 storage bucket (</w:t>
       </w:r>
       <w:r>
@@ -2926,16 +3013,7 @@
           <w:sz w:val="22"/>
           <w:szCs w:val="22"/>
         </w:rPr>
-        <w:t xml:space="preserve"> </w:t>
-      </w:r>
-      <w:r>
-        <w:rPr>
-          <w:rFonts w:ascii="Calibri" w:eastAsia="Times New Roman" w:hAnsi="Calibri" w:cs="Calibri"/>
-          <w:color w:val="1A1A1A"/>
-          <w:sz w:val="22"/>
-          <w:szCs w:val="22"/>
-        </w:rPr>
-        <w:t xml:space="preserve">trigger: every new sign-up gets a </w:t>
+        <w:t xml:space="preserve"> trigger: every new sign-up gets a </w:t>
       </w:r>
       <w:r>
         <w:rPr>
@@ -2999,8 +3077,7 @@
           <w:sz w:val="22"/>
           <w:szCs w:val="22"/>
         </w:rPr>
-        <w:lastRenderedPageBreak/>
-        <w:t>Deployed SQL lives in 9 numbered files (</w:t>
+        <w:t>Deployed SQL lives in 10 numbered files (</w:t>
       </w:r>
       <w:r>
         <w:rPr>
@@ -3016,13 +3093,45 @@
           <w:sz w:val="22"/>
           <w:szCs w:val="22"/>
         </w:rPr>
-        <w:t xml:space="preserve"> … </w:t>
+        <w:t xml:space="preserve"> through </w:t>
       </w:r>
       <w:r>
         <w:rPr>
           <w:rStyle w:val="HTMLCode"/>
           <w:color w:val="1A1A1A"/>
         </w:rPr>
+        <w:t>09_delete_own_pending</w:t>
+      </w:r>
+      <w:r>
+        <w:rPr>
+          <w:rFonts w:ascii="Calibri" w:eastAsia="Times New Roman" w:hAnsi="Calibri" w:cs="Calibri"/>
+          <w:color w:val="1A1A1A"/>
+          <w:sz w:val="22"/>
+          <w:szCs w:val="22"/>
+        </w:rPr>
+        <w:t xml:space="preserve">, plus </w:t>
+      </w:r>
+      <w:r>
+        <w:rPr>
+          <w:rStyle w:val="HTMLCode"/>
+          <w:color w:val="1A1A1A"/>
+        </w:rPr>
+        <w:t>07_demo_data</w:t>
+      </w:r>
+      <w:r>
+        <w:rPr>
+          <w:rFonts w:ascii="Calibri" w:eastAsia="Times New Roman" w:hAnsi="Calibri" w:cs="Calibri"/>
+          <w:color w:val="1A1A1A"/>
+          <w:sz w:val="22"/>
+          <w:szCs w:val="22"/>
+        </w:rPr>
+        <w:t xml:space="preserve"> and </w:t>
+      </w:r>
+      <w:r>
+        <w:rPr>
+          <w:rStyle w:val="HTMLCode"/>
+          <w:color w:val="1A1A1A"/>
+        </w:rPr>
         <w:t>08_backfill_profiles</w:t>
       </w:r>
       <w:r>
@@ -3032,45 +3141,29 @@
           <w:sz w:val="22"/>
           <w:szCs w:val="22"/>
         </w:rPr>
-        <w:t xml:space="preserve">, </w:t>
+        <w:t xml:space="preserve"> which are optional/repair scripts), together with a generated one-paste bundle </w:t>
       </w:r>
       <w:r>
         <w:rPr>
           <w:rStyle w:val="HTMLCode"/>
           <w:color w:val="1A1A1A"/>
         </w:rPr>
-        <w:t>07_demo_data</w:t>
-      </w:r>
-      <w:r>
-        <w:rPr>
-          <w:rFonts w:ascii="Calibri" w:eastAsia="Times New Roman" w:hAnsi="Calibri" w:cs="Calibri"/>
-          <w:color w:val="1A1A1A"/>
-          <w:sz w:val="22"/>
-          <w:szCs w:val="22"/>
-        </w:rPr>
-        <w:t xml:space="preserve">), plus a generated one-paste bundle </w:t>
+        <w:t>setup_all.sql</w:t>
+      </w:r>
+      <w:r>
+        <w:rPr>
+          <w:rFonts w:ascii="Calibri" w:eastAsia="Times New Roman" w:hAnsi="Calibri" w:cs="Calibri"/>
+          <w:color w:val="1A1A1A"/>
+          <w:sz w:val="22"/>
+          <w:szCs w:val="22"/>
+        </w:rPr>
+        <w:t xml:space="preserve"> (see </w:t>
       </w:r>
       <w:r>
         <w:rPr>
           <w:rStyle w:val="HTMLCode"/>
           <w:color w:val="1A1A1A"/>
         </w:rPr>
-        <w:t>setup_all.sql</w:t>
-      </w:r>
-      <w:r>
-        <w:rPr>
-          <w:rFonts w:ascii="Calibri" w:eastAsia="Times New Roman" w:hAnsi="Calibri" w:cs="Calibri"/>
-          <w:color w:val="1A1A1A"/>
-          <w:sz w:val="22"/>
-          <w:szCs w:val="22"/>
-        </w:rPr>
-        <w:t xml:space="preserve"> (see </w:t>
-      </w:r>
-      <w:r>
-        <w:rPr>
-          <w:rStyle w:val="HTMLCode"/>
-          <w:color w:val="1A1A1A"/>
-        </w:rPr>
         <w:t>tools/bundle-db-sql.ps1</w:t>
       </w:r>
       <w:r>
@@ -3100,7 +3193,7 @@
           <w:sz w:val="22"/>
           <w:szCs w:val="22"/>
         </w:rPr>
-        <w:pict w14:anchorId="259A9693">
+        <w:pict w14:anchorId="06CE1CD5">
           <v:rect id="_x0000_i1029" style="width:0;height:1.5pt" o:hralign="center" o:hrstd="t" o:hr="t" fillcolor="#a0a0a0" stroked="f"/>
         </w:pict>
       </w:r>
@@ -3420,7 +3513,16 @@
                 <w:sz w:val="21"/>
                 <w:szCs w:val="21"/>
               </w:rPr>
-              <w:t xml:space="preserve">, </w:t>
+              <w:t>,</w:t>
+            </w:r>
+            <w:r>
+              <w:rPr>
+                <w:rFonts w:ascii="Calibri" w:eastAsia="Times New Roman" w:hAnsi="Calibri" w:cs="Calibri"/>
+                <w:color w:val="1A1A1A"/>
+                <w:sz w:val="21"/>
+                <w:szCs w:val="21"/>
+              </w:rPr>
+              <w:t xml:space="preserve"> </w:t>
             </w:r>
             <w:r>
               <w:rPr>
@@ -3963,7 +4065,7 @@
           <w:sz w:val="22"/>
           <w:szCs w:val="22"/>
         </w:rPr>
-        <w:pict w14:anchorId="368F4132">
+        <w:pict w14:anchorId="2C34D98B">
           <v:rect id="_x0000_i1030" style="width:0;height:1.5pt" o:hralign="center" o:hrstd="t" o:hr="t" fillcolor="#a0a0a0" stroked="f"/>
         </w:pict>
       </w:r>
@@ -4097,6 +4199,7 @@
           <w:sz w:val="22"/>
           <w:szCs w:val="22"/>
         </w:rPr>
+        <w:lastRenderedPageBreak/>
         <w:t>Key hygiene:</w:t>
       </w:r>
       <w:r>
@@ -4206,7 +4309,7 @@
           <w:sz w:val="22"/>
           <w:szCs w:val="22"/>
         </w:rPr>
-        <w:pict w14:anchorId="30C4F30E">
+        <w:pict w14:anchorId="028A6BE3">
           <v:rect id="_x0000_i1031" style="width:0;height:1.5pt" o:hralign="center" o:hrstd="t" o:hr="t" fillcolor="#a0a0a0" stroked="f"/>
         </w:pict>
       </w:r>
@@ -4222,7 +4325,6 @@
         <w:rPr>
           <w:rFonts w:ascii="Calibri" w:eastAsia="Times New Roman" w:hAnsi="Calibri" w:cs="Calibri"/>
         </w:rPr>
-        <w:lastRenderedPageBreak/>
         <w:t>7. Deployment</w:t>
       </w:r>
     </w:p>
@@ -5476,7 +5578,8 @@
           <w:sz w:val="22"/>
           <w:szCs w:val="22"/>
         </w:rPr>
-        <w:pict w14:anchorId="0EAD3C67">
+        <w:lastRenderedPageBreak/>
+        <w:pict w14:anchorId="13599465">
           <v:rect id="_x0000_i1032" style="width:0;height:1.5pt" o:hralign="center" o:hrstd="t" o:hr="t" fillcolor="#a0a0a0" stroked="f"/>
         </w:pict>
       </w:r>
@@ -5537,7 +5640,6 @@
           <w:sz w:val="22"/>
           <w:szCs w:val="22"/>
         </w:rPr>
-        <w:lastRenderedPageBreak/>
         <w:t xml:space="preserve">EAS upload died with </w:t>
       </w:r>
       <w:r>
@@ -6214,7 +6316,7 @@
           <w:sz w:val="22"/>
           <w:szCs w:val="22"/>
         </w:rPr>
-        <w:pict w14:anchorId="26F2E681">
+        <w:pict w14:anchorId="6E9EB19F">
           <v:rect id="_x0000_i1033" style="width:0;height:1.5pt" o:hralign="center" o:hrstd="t" o:hr="t" fillcolor="#a0a0a0" stroked="f"/>
         </w:pict>
       </w:r>
@@ -7251,7 +7353,7 @@
           <w:sz w:val="22"/>
           <w:szCs w:val="22"/>
         </w:rPr>
-        <w:pict w14:anchorId="4F81A759">
+        <w:pict w14:anchorId="591103D1">
           <v:rect id="_x0000_i1034" style="width:0;height:1.5pt" o:hralign="center" o:hrstd="t" o:hr="t" fillcolor="#a0a0a0" stroked="f"/>
         </w:pict>
       </w:r>
@@ -7488,7 +7590,7 @@
           <w:sz w:val="22"/>
           <w:szCs w:val="22"/>
         </w:rPr>
-        <w:pict w14:anchorId="3BFDDBEC">
+        <w:pict w14:anchorId="7CCC47DB">
           <v:rect id="_x0000_i1035" style="width:0;height:1.5pt" o:hralign="center" o:hrstd="t" o:hr="t" fillcolor="#a0a0a0" stroked="f"/>
         </w:pict>
       </w:r>
@@ -7669,6 +7771,62 @@
     </w:p>
     <w:p>
       <w:pPr>
+        <w:numPr>
+          <w:ilvl w:val="0"/>
+          <w:numId w:val="9"/>
+        </w:numPr>
+        <w:spacing w:before="100" w:beforeAutospacing="1" w:after="100" w:afterAutospacing="1"/>
+        <w:rPr>
+          <w:rFonts w:ascii="Calibri" w:eastAsia="Times New Roman" w:hAnsi="Calibri" w:cs="Calibri"/>
+          <w:color w:val="1A1A1A"/>
+          <w:sz w:val="22"/>
+          <w:szCs w:val="22"/>
+        </w:rPr>
+      </w:pPr>
+      <w:r>
+        <w:rPr>
+          <w:rFonts w:ascii="Calibri" w:eastAsia="Times New Roman" w:hAnsi="Calibri" w:cs="Calibri"/>
+          <w:color w:val="1A1A1A"/>
+          <w:sz w:val="22"/>
+          <w:szCs w:val="22"/>
+        </w:rPr>
+        <w:t xml:space="preserve">iOS TestFlight distribution - the code is already cross-platform and the iOS permission strings are configured in </w:t>
+      </w:r>
+      <w:r>
+        <w:rPr>
+          <w:rStyle w:val="HTMLCode"/>
+          <w:color w:val="1A1A1A"/>
+        </w:rPr>
+        <w:t>app.json</w:t>
+      </w:r>
+      <w:r>
+        <w:rPr>
+          <w:rFonts w:ascii="Calibri" w:eastAsia="Times New Roman" w:hAnsi="Calibri" w:cs="Calibri"/>
+          <w:color w:val="1A1A1A"/>
+          <w:sz w:val="22"/>
+          <w:szCs w:val="22"/>
+        </w:rPr>
+        <w:t xml:space="preserve">; the only requirement is the paid Apple Developer Program (US$99/yr). The full runbook is in </w:t>
+      </w:r>
+      <w:r>
+        <w:rPr>
+          <w:rStyle w:val="HTMLCode"/>
+          <w:color w:val="1A1A1A"/>
+        </w:rPr>
+        <w:t>docs/DEPLOY.md</w:t>
+      </w:r>
+      <w:r>
+        <w:rPr>
+          <w:rFonts w:ascii="Calibri" w:eastAsia="Times New Roman" w:hAnsi="Calibri" w:cs="Calibri"/>
+          <w:color w:val="1A1A1A"/>
+          <w:sz w:val="22"/>
+          <w:szCs w:val="22"/>
+        </w:rPr>
+        <w:t xml:space="preserve"> ("iOS (optional)").</w:t>
+      </w:r>
+    </w:p>
+    <w:p>
+      <w:pPr>
         <w:spacing w:before="330" w:after="330"/>
         <w:rPr>
           <w:rFonts w:ascii="Calibri" w:eastAsia="Times New Roman" w:hAnsi="Calibri" w:cs="Calibri"/>
@@ -7684,7 +7842,7 @@
           <w:sz w:val="22"/>
           <w:szCs w:val="22"/>
         </w:rPr>
-        <w:pict w14:anchorId="14EAB75E">
+        <w:pict w14:anchorId="43EDA215">
           <v:rect id="_x0000_i1036" style="width:0;height:1.5pt" o:hralign="center" o:hrstd="t" o:hr="t" fillcolor="#a0a0a0" stroked="f"/>
         </w:pict>
       </w:r>
@@ -7788,9 +7946,12 @@
           <w:szCs w:val="19"/>
           <w:shd w:val="clear" w:color="auto" w:fill="F0F4F1"/>
         </w:rPr>
-        <w:t xml:space="preserve">│   ├── eas.json               </w:t>
-      </w:r>
-      <w:r>
+        <w:t>│   ├── eas.json               build profiles + EXPO_PUBLIC_* Supabase env</w:t>
+      </w:r>
+    </w:p>
+    <w:p>
+      <w:pPr>
+        <w:pStyle w:val="HTMLPreformatted"/>
         <w:rPr>
           <w:rFonts w:ascii="Consolas" w:hAnsi="Consolas"/>
           <w:color w:val="1A1A1A"/>
@@ -7798,12 +7959,8 @@
           <w:szCs w:val="19"/>
           <w:shd w:val="clear" w:color="auto" w:fill="F0F4F1"/>
         </w:rPr>
-        <w:t>build profiles + EXPO_PUBLIC_* Supabase env</w:t>
-      </w:r>
-    </w:p>
-    <w:p>
-      <w:pPr>
-        <w:pStyle w:val="HTMLPreformatted"/>
+      </w:pPr>
+      <w:r>
         <w:rPr>
           <w:rFonts w:ascii="Consolas" w:hAnsi="Consolas"/>
           <w:color w:val="1A1A1A"/>
@@ -7811,8 +7968,12 @@
           <w:szCs w:val="19"/>
           <w:shd w:val="clear" w:color="auto" w:fill="F0F4F1"/>
         </w:rPr>
-      </w:pPr>
-      <w:r>
+        <w:t>│   └── src/</w:t>
+      </w:r>
+    </w:p>
+    <w:p>
+      <w:pPr>
+        <w:pStyle w:val="HTMLPreformatted"/>
         <w:rPr>
           <w:rFonts w:ascii="Consolas" w:hAnsi="Consolas"/>
           <w:color w:val="1A1A1A"/>
@@ -7820,12 +7981,8 @@
           <w:szCs w:val="19"/>
           <w:shd w:val="clear" w:color="auto" w:fill="F0F4F1"/>
         </w:rPr>
-        <w:t>│   └── src/</w:t>
-      </w:r>
-    </w:p>
-    <w:p>
-      <w:pPr>
-        <w:pStyle w:val="HTMLPreformatted"/>
+      </w:pPr>
+      <w:r>
         <w:rPr>
           <w:rFonts w:ascii="Consolas" w:hAnsi="Consolas"/>
           <w:color w:val="1A1A1A"/>
@@ -7833,8 +7990,12 @@
           <w:szCs w:val="19"/>
           <w:shd w:val="clear" w:color="auto" w:fill="F0F4F1"/>
         </w:rPr>
-      </w:pPr>
-      <w:r>
+        <w:t>│       ├── screens/           Home, Login, Register, NewRecord, MyRecords,</w:t>
+      </w:r>
+    </w:p>
+    <w:p>
+      <w:pPr>
+        <w:pStyle w:val="HTMLPreformatted"/>
         <w:rPr>
           <w:rFonts w:ascii="Consolas" w:hAnsi="Consolas"/>
           <w:color w:val="1A1A1A"/>
@@ -7842,12 +8003,8 @@
           <w:szCs w:val="19"/>
           <w:shd w:val="clear" w:color="auto" w:fill="F0F4F1"/>
         </w:rPr>
-        <w:t>│       ├── screens/           Home, Login, Register, NewRecord, MyRecords,</w:t>
-      </w:r>
-    </w:p>
-    <w:p>
-      <w:pPr>
-        <w:pStyle w:val="HTMLPreformatted"/>
+      </w:pPr>
+      <w:r>
         <w:rPr>
           <w:rFonts w:ascii="Consolas" w:hAnsi="Consolas"/>
           <w:color w:val="1A1A1A"/>
@@ -7855,8 +8012,12 @@
           <w:szCs w:val="19"/>
           <w:shd w:val="clear" w:color="auto" w:fill="F0F4F1"/>
         </w:rPr>
-      </w:pPr>
-      <w:r>
+        <w:t>│       │                      RecordDetails, Notifications</w:t>
+      </w:r>
+    </w:p>
+    <w:p>
+      <w:pPr>
+        <w:pStyle w:val="HTMLPreformatted"/>
         <w:rPr>
           <w:rFonts w:ascii="Consolas" w:hAnsi="Consolas"/>
           <w:color w:val="1A1A1A"/>
@@ -7864,12 +8025,8 @@
           <w:szCs w:val="19"/>
           <w:shd w:val="clear" w:color="auto" w:fill="F0F4F1"/>
         </w:rPr>
-        <w:t>│       │                      RecordDetails, Notifications</w:t>
-      </w:r>
-    </w:p>
-    <w:p>
-      <w:pPr>
-        <w:pStyle w:val="HTMLPreformatted"/>
+      </w:pPr>
+      <w:r>
         <w:rPr>
           <w:rFonts w:ascii="Consolas" w:hAnsi="Consolas"/>
           <w:color w:val="1A1A1A"/>
@@ -7877,8 +8034,12 @@
           <w:szCs w:val="19"/>
           <w:shd w:val="clear" w:color="auto" w:fill="F0F4F1"/>
         </w:rPr>
-      </w:pPr>
-      <w:r>
+        <w:t>│       ├── context/           AuthContext (session)</w:t>
+      </w:r>
+    </w:p>
+    <w:p>
+      <w:pPr>
+        <w:pStyle w:val="HTMLPreformatted"/>
         <w:rPr>
           <w:rFonts w:ascii="Consolas" w:hAnsi="Consolas"/>
           <w:color w:val="1A1A1A"/>
@@ -7886,12 +8047,8 @@
           <w:szCs w:val="19"/>
           <w:shd w:val="clear" w:color="auto" w:fill="F0F4F1"/>
         </w:rPr>
-        <w:t>│       ├── context/           AuthContext (session)</w:t>
-      </w:r>
-    </w:p>
-    <w:p>
-      <w:pPr>
-        <w:pStyle w:val="HTMLPreformatted"/>
+      </w:pPr>
+      <w:r>
         <w:rPr>
           <w:rFonts w:ascii="Consolas" w:hAnsi="Consolas"/>
           <w:color w:val="1A1A1A"/>
@@ -7899,7 +8056,8 @@
           <w:szCs w:val="19"/>
           <w:shd w:val="clear" w:color="auto" w:fill="F0F4F1"/>
         </w:rPr>
-      </w:pPr>
+        <w:t xml:space="preserve">│       </w:t>
+      </w:r>
       <w:r>
         <w:rPr>
           <w:rFonts w:ascii="Consolas" w:hAnsi="Consolas"/>
@@ -7908,7 +8066,7 @@
           <w:szCs w:val="19"/>
           <w:shd w:val="clear" w:color="auto" w:fill="F0F4F1"/>
         </w:rPr>
-        <w:t>│       └── navigation/        RootNavigator</w:t>
+        <w:t>└── navigation/        RootNavigator</w:t>
       </w:r>
     </w:p>
     <w:p>
@@ -8018,9 +8176,12 @@
           <w:szCs w:val="19"/>
           <w:shd w:val="clear" w:color="auto" w:fill="F0F4F1"/>
         </w:rPr>
-        <w:t xml:space="preserve">│       ├── (app)/map/   </w:t>
-      </w:r>
-      <w:r>
+        <w:t>│       ├── (app)/map/         Leaflet map</w:t>
+      </w:r>
+    </w:p>
+    <w:p>
+      <w:pPr>
+        <w:pStyle w:val="HTMLPreformatted"/>
         <w:rPr>
           <w:rFonts w:ascii="Consolas" w:hAnsi="Consolas"/>
           <w:color w:val="1A1A1A"/>
@@ -8028,12 +8189,8 @@
           <w:szCs w:val="19"/>
           <w:shd w:val="clear" w:color="auto" w:fill="F0F4F1"/>
         </w:rPr>
-        <w:t xml:space="preserve">      Leaflet map</w:t>
-      </w:r>
-    </w:p>
-    <w:p>
-      <w:pPr>
-        <w:pStyle w:val="HTMLPreformatted"/>
+      </w:pPr>
+      <w:r>
         <w:rPr>
           <w:rFonts w:ascii="Consolas" w:hAnsi="Consolas"/>
           <w:color w:val="1A1A1A"/>
@@ -8041,8 +8198,12 @@
           <w:szCs w:val="19"/>
           <w:shd w:val="clear" w:color="auto" w:fill="F0F4F1"/>
         </w:rPr>
-      </w:pPr>
-      <w:r>
+        <w:t>│       ├── (app)/zones/       zone management</w:t>
+      </w:r>
+    </w:p>
+    <w:p>
+      <w:pPr>
+        <w:pStyle w:val="HTMLPreformatted"/>
         <w:rPr>
           <w:rFonts w:ascii="Consolas" w:hAnsi="Consolas"/>
           <w:color w:val="1A1A1A"/>
@@ -8050,12 +8211,8 @@
           <w:szCs w:val="19"/>
           <w:shd w:val="clear" w:color="auto" w:fill="F0F4F1"/>
         </w:rPr>
-        <w:t>│       ├── (app)/zones/       zone management</w:t>
-      </w:r>
-    </w:p>
-    <w:p>
-      <w:pPr>
-        <w:pStyle w:val="HTMLPreformatted"/>
+      </w:pPr>
+      <w:r>
         <w:rPr>
           <w:rFonts w:ascii="Consolas" w:hAnsi="Consolas"/>
           <w:color w:val="1A1A1A"/>
@@ -8063,8 +8220,12 @@
           <w:szCs w:val="19"/>
           <w:shd w:val="clear" w:color="auto" w:fill="F0F4F1"/>
         </w:rPr>
-      </w:pPr>
-      <w:r>
+        <w:t>│       ├── (app)/users/       user management</w:t>
+      </w:r>
+    </w:p>
+    <w:p>
+      <w:pPr>
+        <w:pStyle w:val="HTMLPreformatted"/>
         <w:rPr>
           <w:rFonts w:ascii="Consolas" w:hAnsi="Consolas"/>
           <w:color w:val="1A1A1A"/>
@@ -8072,12 +8233,8 @@
           <w:szCs w:val="19"/>
           <w:shd w:val="clear" w:color="auto" w:fill="F0F4F1"/>
         </w:rPr>
-        <w:t>│       ├── (app)/users/       user management</w:t>
-      </w:r>
-    </w:p>
-    <w:p>
-      <w:pPr>
-        <w:pStyle w:val="HTMLPreformatted"/>
+      </w:pPr>
+      <w:r>
         <w:rPr>
           <w:rFonts w:ascii="Consolas" w:hAnsi="Consolas"/>
           <w:color w:val="1A1A1A"/>
@@ -8085,8 +8242,12 @@
           <w:szCs w:val="19"/>
           <w:shd w:val="clear" w:color="auto" w:fill="F0F4F1"/>
         </w:rPr>
-      </w:pPr>
-      <w:r>
+        <w:t>│       └── api/export/     →  hazard PDF export (pdfkit)</w:t>
+      </w:r>
+    </w:p>
+    <w:p>
+      <w:pPr>
+        <w:pStyle w:val="HTMLPreformatted"/>
         <w:rPr>
           <w:rFonts w:ascii="Consolas" w:hAnsi="Consolas"/>
           <w:color w:val="1A1A1A"/>
@@ -8094,12 +8255,8 @@
           <w:szCs w:val="19"/>
           <w:shd w:val="clear" w:color="auto" w:fill="F0F4F1"/>
         </w:rPr>
-        <w:t>│       └── api/export/     →  hazard PDF export (pdfkit)</w:t>
-      </w:r>
-    </w:p>
-    <w:p>
-      <w:pPr>
-        <w:pStyle w:val="HTMLPreformatted"/>
+      </w:pPr>
+      <w:r>
         <w:rPr>
           <w:rFonts w:ascii="Consolas" w:hAnsi="Consolas"/>
           <w:color w:val="1A1A1A"/>
@@ -8107,8 +8264,12 @@
           <w:szCs w:val="19"/>
           <w:shd w:val="clear" w:color="auto" w:fill="F0F4F1"/>
         </w:rPr>
-      </w:pPr>
-      <w:r>
+        <w:t>├── supabase/                  01_schema … 09_delete_own_pending, 07_demo_data,</w:t>
+      </w:r>
+    </w:p>
+    <w:p>
+      <w:pPr>
+        <w:pStyle w:val="HTMLPreformatted"/>
         <w:rPr>
           <w:rFonts w:ascii="Consolas" w:hAnsi="Consolas"/>
           <w:color w:val="1A1A1A"/>
@@ -8116,12 +8277,8 @@
           <w:szCs w:val="19"/>
           <w:shd w:val="clear" w:color="auto" w:fill="F0F4F1"/>
         </w:rPr>
-        <w:t>├── supabase/                  01_schema … 07_demo_data, 08_backfill_profiles,</w:t>
-      </w:r>
-    </w:p>
-    <w:p>
-      <w:pPr>
-        <w:pStyle w:val="HTMLPreformatted"/>
+      </w:pPr>
+      <w:r>
         <w:rPr>
           <w:rFonts w:ascii="Consolas" w:hAnsi="Consolas"/>
           <w:color w:val="1A1A1A"/>
@@ -8129,7 +8286,8 @@
           <w:szCs w:val="19"/>
           <w:shd w:val="clear" w:color="auto" w:fill="F0F4F1"/>
         </w:rPr>
-      </w:pPr>
+        <w:t xml:space="preserve">│   </w:t>
+      </w:r>
       <w:r>
         <w:rPr>
           <w:rFonts w:ascii="Consolas" w:hAnsi="Consolas"/>
@@ -8138,7 +8296,7 @@
           <w:szCs w:val="19"/>
           <w:shd w:val="clear" w:color="auto" w:fill="F0F4F1"/>
         </w:rPr>
-        <w:t>│                              generated setup_all.sql bundle (gitignored)</w:t>
+        <w:t xml:space="preserve">                           08_backfill_profiles, generated setup_all.sql (gitignored)</w:t>
       </w:r>
     </w:p>
     <w:p>
@@ -8204,17 +8362,7 @@
           <w:szCs w:val="19"/>
           <w:shd w:val="clear" w:color="auto" w:fill="F0F4F1"/>
         </w:rPr>
-        <w:t xml:space="preserve">                     </w:t>
-      </w:r>
-      <w:r>
-        <w:rPr>
-          <w:rFonts w:ascii="Consolas" w:hAnsi="Consolas"/>
-          <w:color w:val="1A1A1A"/>
-          <w:sz w:val="19"/>
-          <w:szCs w:val="19"/>
-          <w:shd w:val="clear" w:color="auto" w:fill="F0F4F1"/>
-        </w:rPr>
-        <w:t xml:space="preserve">          · SETUP · DEPLOY · PROJECT_REPORT (this file)</w:t>
+        <w:t xml:space="preserve">                               · SETUP · DEPLOY · PROJECT_REPORT (this file)</w:t>
       </w:r>
     </w:p>
     <w:p>
@@ -8889,7 +9037,7 @@
           <w:sz w:val="22"/>
           <w:szCs w:val="22"/>
         </w:rPr>
-        <w:pict w14:anchorId="0B894155">
+        <w:pict w14:anchorId="0E6FCD7C">
           <v:rect id="_x0000_i1037" style="width:0;height:1.5pt" o:hralign="center" o:hrstd="t" o:hr="t" fillcolor="#a0a0a0" stroked="f"/>
         </w:pict>
       </w:r>
@@ -8945,9 +9093,9 @@
 <file path=word/numbering.xml><?xml version="1.0" encoding="utf-8"?>
 <w:numbering xmlns:wpc="http://schemas.microsoft.com/office/word/2010/wordprocessingCanvas" xmlns:cx="http://schemas.microsoft.com/office/drawing/2014/chartex" xmlns:cx1="http://schemas.microsoft.com/office/drawing/2015/9/8/chartex" xmlns:cx2="http://schemas.microsoft.com/office/drawing/2015/10/21/chartex" xmlns:cx3="http://schemas.microsoft.com/office/drawing/2016/5/9/chartex" xmlns:cx4="http://schemas.microsoft.com/office/drawing/2016/5/10/chartex" xmlns:cx5="http://schemas.microsoft.com/office/drawing/2016/5/11/chartex" xmlns:cx6="http://schemas.microsoft.com/office/drawing/2016/5/12/chartex" xmlns:cx7="http://schemas.microsoft.com/office/drawing/2016/5/13/chartex" xmlns:cx8="http://schemas.microsoft.com/office/drawing/2016/5/14/chartex" xmlns:mc="http://schemas.openxmlformats.org/markup-compatibility/2006" xmlns:aink="http://schemas.microsoft.com/office/drawing/2016/ink" xmlns:am3d="http://schemas.microsoft.com/office/drawing/2017/model3d" xmlns:o="urn:schemas-microsoft-com:office:office" xmlns:oel="http://schemas.microsoft.com/office/2019/extlst" xmlns:r="http://schemas.openxmlformats.org/officeDocument/2006/relationships" xmlns:m="http://schemas.openxmlformats.org/officeDocument/2006/math" xmlns:v="urn:schemas-microsoft-com:vml" xmlns:wp14="http://schemas.microsoft.com/office/word/2010/wordprocessingDrawing" xmlns:wp="http://schemas.openxmlformats.org/drawingml/2006/wordprocessingDrawing" xmlns:w10="urn:schemas-microsoft-com:office:word" xmlns:w="http://schemas.openxmlformats.org/wordprocessingml/2006/main" xmlns:w14="http://schemas.microsoft.com/office/word/2010/wordml" xmlns:w15="http://schemas.microsoft.com/office/word/2012/wordml" xmlns:w16cex="http://schemas.microsoft.com/office/word/2018/wordml/cex" xmlns:w16cid="http://schemas.microsoft.com/office/word/2016/wordml/cid" xmlns:w16="http://schemas.microsoft.com/office/word/2018/wordml" xmlns:w16du="http://schemas.microsoft.com/office/word/2023/wordml/word16du" xmlns:w16sdtdh="http://schemas.microsoft.com/office/word/2020/wordml/sdtdatahash" xmlns:w16sdtfl="http://schemas.microsoft.com/office/word/2024/wordml/sdtformatlock" xmlns:w16se="http://schemas.microsoft.com/office/word/2015/wordml/symex" xmlns:wpg="http://schemas.microsoft.com/office/word/2010/wordprocessingGroup" xmlns:wpi="http://schemas.microsoft.com/office/word/2010/wordprocessingInk" xmlns:wne="http://schemas.microsoft.com/office/word/2006/wordml" xmlns:wps="http://schemas.microsoft.com/office/word/2010/wordprocessingShape" mc:Ignorable="w14 w15 w16se w16cid w16 w16cex w16sdtdh w16sdtfl w16du wp14">
   <w:abstractNum w:abstractNumId="0" w15:restartNumberingAfterBreak="0">
-    <w:nsid w:val="01E8577D"/>
+    <w:nsid w:val="0D442B85"/>
     <w:multiLevelType w:val="multilevel"/>
-    <w:tmpl w:val="5BD8053E"/>
+    <w:tmpl w:val="A3BE56BE"/>
     <w:lvl w:ilvl="0">
       <w:start w:val="1"/>
       <w:numFmt w:val="bullet"/>
@@ -9094,9 +9242,9 @@
     </w:lvl>
   </w:abstractNum>
   <w:abstractNum w:abstractNumId="1" w15:restartNumberingAfterBreak="0">
-    <w:nsid w:val="02192FC3"/>
+    <w:nsid w:val="0EA1641E"/>
     <w:multiLevelType w:val="multilevel"/>
-    <w:tmpl w:val="2D4632E0"/>
+    <w:tmpl w:val="2A30DADC"/>
     <w:lvl w:ilvl="0">
       <w:start w:val="1"/>
       <w:numFmt w:val="bullet"/>
@@ -9243,9 +9391,9 @@
     </w:lvl>
   </w:abstractNum>
   <w:abstractNum w:abstractNumId="2" w15:restartNumberingAfterBreak="0">
-    <w:nsid w:val="25F43531"/>
+    <w:nsid w:val="1FCC7FB7"/>
     <w:multiLevelType w:val="multilevel"/>
-    <w:tmpl w:val="A7C0E864"/>
+    <w:tmpl w:val="B60EE666"/>
     <w:lvl w:ilvl="0">
       <w:start w:val="1"/>
       <w:numFmt w:val="decimal"/>
@@ -9356,9 +9504,9 @@
     </w:lvl>
   </w:abstractNum>
   <w:abstractNum w:abstractNumId="3" w15:restartNumberingAfterBreak="0">
-    <w:nsid w:val="3A8F5265"/>
+    <w:nsid w:val="2ABB7CAF"/>
     <w:multiLevelType w:val="multilevel"/>
-    <w:tmpl w:val="7660DD48"/>
+    <w:tmpl w:val="48C05326"/>
     <w:lvl w:ilvl="0">
       <w:start w:val="1"/>
       <w:numFmt w:val="bullet"/>
@@ -9505,9 +9653,9 @@
     </w:lvl>
   </w:abstractNum>
   <w:abstractNum w:abstractNumId="4" w15:restartNumberingAfterBreak="0">
-    <w:nsid w:val="4C552D36"/>
+    <w:nsid w:val="31C87FA4"/>
     <w:multiLevelType w:val="multilevel"/>
-    <w:tmpl w:val="4C82B0C6"/>
+    <w:tmpl w:val="5AFCE266"/>
     <w:lvl w:ilvl="0">
       <w:start w:val="1"/>
       <w:numFmt w:val="bullet"/>
@@ -9654,9 +9802,9 @@
     </w:lvl>
   </w:abstractNum>
   <w:abstractNum w:abstractNumId="5" w15:restartNumberingAfterBreak="0">
-    <w:nsid w:val="6005776F"/>
+    <w:nsid w:val="41B62691"/>
     <w:multiLevelType w:val="multilevel"/>
-    <w:tmpl w:val="DE3A0C66"/>
+    <w:tmpl w:val="8BBC2AE8"/>
     <w:lvl w:ilvl="0">
       <w:start w:val="1"/>
       <w:numFmt w:val="bullet"/>
@@ -9803,9 +9951,9 @@
     </w:lvl>
   </w:abstractNum>
   <w:abstractNum w:abstractNumId="6" w15:restartNumberingAfterBreak="0">
-    <w:nsid w:val="649159E4"/>
+    <w:nsid w:val="44721943"/>
     <w:multiLevelType w:val="multilevel"/>
-    <w:tmpl w:val="7CFE9E2C"/>
+    <w:tmpl w:val="995833A8"/>
     <w:lvl w:ilvl="0">
       <w:start w:val="1"/>
       <w:numFmt w:val="bullet"/>
@@ -9952,9 +10100,122 @@
     </w:lvl>
   </w:abstractNum>
   <w:abstractNum w:abstractNumId="7" w15:restartNumberingAfterBreak="0">
-    <w:nsid w:val="73530FC8"/>
+    <w:nsid w:val="4B1C438E"/>
     <w:multiLevelType w:val="multilevel"/>
-    <w:tmpl w:val="5F1ADCBA"/>
+    <w:tmpl w:val="C4B024C6"/>
+    <w:lvl w:ilvl="0">
+      <w:start w:val="1"/>
+      <w:numFmt w:val="decimal"/>
+      <w:lvlText w:val="%1."/>
+      <w:lvlJc w:val="left"/>
+      <w:pPr>
+        <w:tabs>
+          <w:tab w:val="num" w:pos="720"/>
+        </w:tabs>
+        <w:ind w:left="720" w:hanging="360"/>
+      </w:pPr>
+    </w:lvl>
+    <w:lvl w:ilvl="1" w:tentative="1">
+      <w:start w:val="1"/>
+      <w:numFmt w:val="decimal"/>
+      <w:lvlText w:val="%2."/>
+      <w:lvlJc w:val="left"/>
+      <w:pPr>
+        <w:tabs>
+          <w:tab w:val="num" w:pos="1440"/>
+        </w:tabs>
+        <w:ind w:left="1440" w:hanging="360"/>
+      </w:pPr>
+    </w:lvl>
+    <w:lvl w:ilvl="2" w:tentative="1">
+      <w:start w:val="1"/>
+      <w:numFmt w:val="decimal"/>
+      <w:lvlText w:val="%3."/>
+      <w:lvlJc w:val="left"/>
+      <w:pPr>
+        <w:tabs>
+          <w:tab w:val="num" w:pos="2160"/>
+        </w:tabs>
+        <w:ind w:left="2160" w:hanging="360"/>
+      </w:pPr>
+    </w:lvl>
+    <w:lvl w:ilvl="3" w:tentative="1">
+      <w:start w:val="1"/>
+      <w:numFmt w:val="decimal"/>
+      <w:lvlText w:val="%4."/>
+      <w:lvlJc w:val="left"/>
+      <w:pPr>
+        <w:tabs>
+          <w:tab w:val="num" w:pos="2880"/>
+        </w:tabs>
+        <w:ind w:left="2880" w:hanging="360"/>
+      </w:pPr>
+    </w:lvl>
+    <w:lvl w:ilvl="4" w:tentative="1">
+      <w:start w:val="1"/>
+      <w:numFmt w:val="decimal"/>
+      <w:lvlText w:val="%5."/>
+      <w:lvlJc w:val="left"/>
+      <w:pPr>
+        <w:tabs>
+          <w:tab w:val="num" w:pos="3600"/>
+        </w:tabs>
+        <w:ind w:left="3600" w:hanging="360"/>
+      </w:pPr>
+    </w:lvl>
+    <w:lvl w:ilvl="5" w:tentative="1">
+      <w:start w:val="1"/>
+      <w:numFmt w:val="decimal"/>
+      <w:lvlText w:val="%6."/>
+      <w:lvlJc w:val="left"/>
+      <w:pPr>
+        <w:tabs>
+          <w:tab w:val="num" w:pos="4320"/>
+        </w:tabs>
+        <w:ind w:left="4320" w:hanging="360"/>
+      </w:pPr>
+    </w:lvl>
+    <w:lvl w:ilvl="6" w:tentative="1">
+      <w:start w:val="1"/>
+      <w:numFmt w:val="decimal"/>
+      <w:lvlText w:val="%7."/>
+      <w:lvlJc w:val="left"/>
+      <w:pPr>
+        <w:tabs>
+          <w:tab w:val="num" w:pos="5040"/>
+        </w:tabs>
+        <w:ind w:left="5040" w:hanging="360"/>
+      </w:pPr>
+    </w:lvl>
+    <w:lvl w:ilvl="7" w:tentative="1">
+      <w:start w:val="1"/>
+      <w:numFmt w:val="decimal"/>
+      <w:lvlText w:val="%8."/>
+      <w:lvlJc w:val="left"/>
+      <w:pPr>
+        <w:tabs>
+          <w:tab w:val="num" w:pos="5760"/>
+        </w:tabs>
+        <w:ind w:left="5760" w:hanging="360"/>
+      </w:pPr>
+    </w:lvl>
+    <w:lvl w:ilvl="8" w:tentative="1">
+      <w:start w:val="1"/>
+      <w:numFmt w:val="decimal"/>
+      <w:lvlText w:val="%9."/>
+      <w:lvlJc w:val="left"/>
+      <w:pPr>
+        <w:tabs>
+          <w:tab w:val="num" w:pos="6480"/>
+        </w:tabs>
+        <w:ind w:left="6480" w:hanging="360"/>
+      </w:pPr>
+    </w:lvl>
+  </w:abstractNum>
+  <w:abstractNum w:abstractNumId="8" w15:restartNumberingAfterBreak="0">
+    <w:nsid w:val="6D2318EB"/>
+    <w:multiLevelType w:val="multilevel"/>
+    <w:tmpl w:val="6A94339E"/>
     <w:lvl w:ilvl="0">
       <w:start w:val="1"/>
       <w:numFmt w:val="bullet"/>
@@ -10100,145 +10361,32 @@
       </w:rPr>
     </w:lvl>
   </w:abstractNum>
-  <w:abstractNum w:abstractNumId="8" w15:restartNumberingAfterBreak="0">
-    <w:nsid w:val="76A56B22"/>
-    <w:multiLevelType w:val="multilevel"/>
-    <w:tmpl w:val="684A723C"/>
-    <w:lvl w:ilvl="0">
-      <w:start w:val="1"/>
-      <w:numFmt w:val="decimal"/>
-      <w:lvlText w:val="%1."/>
-      <w:lvlJc w:val="left"/>
-      <w:pPr>
-        <w:tabs>
-          <w:tab w:val="num" w:pos="720"/>
-        </w:tabs>
-        <w:ind w:left="720" w:hanging="360"/>
-      </w:pPr>
-    </w:lvl>
-    <w:lvl w:ilvl="1" w:tentative="1">
-      <w:start w:val="1"/>
-      <w:numFmt w:val="decimal"/>
-      <w:lvlText w:val="%2."/>
-      <w:lvlJc w:val="left"/>
-      <w:pPr>
-        <w:tabs>
-          <w:tab w:val="num" w:pos="1440"/>
-        </w:tabs>
-        <w:ind w:left="1440" w:hanging="360"/>
-      </w:pPr>
-    </w:lvl>
-    <w:lvl w:ilvl="2" w:tentative="1">
-      <w:start w:val="1"/>
-      <w:numFmt w:val="decimal"/>
-      <w:lvlText w:val="%3."/>
-      <w:lvlJc w:val="left"/>
-      <w:pPr>
-        <w:tabs>
-          <w:tab w:val="num" w:pos="2160"/>
-        </w:tabs>
-        <w:ind w:left="2160" w:hanging="360"/>
-      </w:pPr>
-    </w:lvl>
-    <w:lvl w:ilvl="3" w:tentative="1">
-      <w:start w:val="1"/>
-      <w:numFmt w:val="decimal"/>
-      <w:lvlText w:val="%4."/>
-      <w:lvlJc w:val="left"/>
-      <w:pPr>
-        <w:tabs>
-          <w:tab w:val="num" w:pos="2880"/>
-        </w:tabs>
-        <w:ind w:left="2880" w:hanging="360"/>
-      </w:pPr>
-    </w:lvl>
-    <w:lvl w:ilvl="4" w:tentative="1">
-      <w:start w:val="1"/>
-      <w:numFmt w:val="decimal"/>
-      <w:lvlText w:val="%5."/>
-      <w:lvlJc w:val="left"/>
-      <w:pPr>
-        <w:tabs>
-          <w:tab w:val="num" w:pos="3600"/>
-        </w:tabs>
-        <w:ind w:left="3600" w:hanging="360"/>
-      </w:pPr>
-    </w:lvl>
-    <w:lvl w:ilvl="5" w:tentative="1">
-      <w:start w:val="1"/>
-      <w:numFmt w:val="decimal"/>
-      <w:lvlText w:val="%6."/>
-      <w:lvlJc w:val="left"/>
-      <w:pPr>
-        <w:tabs>
-          <w:tab w:val="num" w:pos="4320"/>
-        </w:tabs>
-        <w:ind w:left="4320" w:hanging="360"/>
-      </w:pPr>
-    </w:lvl>
-    <w:lvl w:ilvl="6" w:tentative="1">
-      <w:start w:val="1"/>
-      <w:numFmt w:val="decimal"/>
-      <w:lvlText w:val="%7."/>
-      <w:lvlJc w:val="left"/>
-      <w:pPr>
-        <w:tabs>
-          <w:tab w:val="num" w:pos="5040"/>
-        </w:tabs>
-        <w:ind w:left="5040" w:hanging="360"/>
-      </w:pPr>
-    </w:lvl>
-    <w:lvl w:ilvl="7" w:tentative="1">
-      <w:start w:val="1"/>
-      <w:numFmt w:val="decimal"/>
-      <w:lvlText w:val="%8."/>
-      <w:lvlJc w:val="left"/>
-      <w:pPr>
-        <w:tabs>
-          <w:tab w:val="num" w:pos="5760"/>
-        </w:tabs>
-        <w:ind w:left="5760" w:hanging="360"/>
-      </w:pPr>
-    </w:lvl>
-    <w:lvl w:ilvl="8" w:tentative="1">
-      <w:start w:val="1"/>
-      <w:numFmt w:val="decimal"/>
-      <w:lvlText w:val="%9."/>
-      <w:lvlJc w:val="left"/>
-      <w:pPr>
-        <w:tabs>
-          <w:tab w:val="num" w:pos="6480"/>
-        </w:tabs>
-        <w:ind w:left="6480" w:hanging="360"/>
-      </w:pPr>
-    </w:lvl>
-  </w:abstractNum>
-  <w:num w:numId="1" w16cid:durableId="1955357635">
+  <w:num w:numId="1" w16cid:durableId="2056930501">
+    <w:abstractNumId w:val="4"/>
+  </w:num>
+  <w:num w:numId="2" w16cid:durableId="1483961255">
+    <w:abstractNumId w:val="1"/>
+  </w:num>
+  <w:num w:numId="3" w16cid:durableId="166140803">
+    <w:abstractNumId w:val="0"/>
+  </w:num>
+  <w:num w:numId="4" w16cid:durableId="373699592">
+    <w:abstractNumId w:val="3"/>
+  </w:num>
+  <w:num w:numId="5" w16cid:durableId="335772624">
+    <w:abstractNumId w:val="6"/>
+  </w:num>
+  <w:num w:numId="6" w16cid:durableId="1156605701">
     <w:abstractNumId w:val="5"/>
   </w:num>
-  <w:num w:numId="2" w16cid:durableId="1112549618">
-    <w:abstractNumId w:val="7"/>
+  <w:num w:numId="7" w16cid:durableId="813060935">
+    <w:abstractNumId w:val="2"/>
   </w:num>
-  <w:num w:numId="3" w16cid:durableId="1119105560">
-    <w:abstractNumId w:val="0"/>
-  </w:num>
-  <w:num w:numId="4" w16cid:durableId="1549609351">
-    <w:abstractNumId w:val="3"/>
-  </w:num>
-  <w:num w:numId="5" w16cid:durableId="1342658389">
-    <w:abstractNumId w:val="6"/>
-  </w:num>
-  <w:num w:numId="6" w16cid:durableId="279996110">
-    <w:abstractNumId w:val="1"/>
-  </w:num>
-  <w:num w:numId="7" w16cid:durableId="57361756">
+  <w:num w:numId="8" w16cid:durableId="1402555662">
     <w:abstractNumId w:val="8"/>
   </w:num>
-  <w:num w:numId="8" w16cid:durableId="419837982">
-    <w:abstractNumId w:val="4"/>
-  </w:num>
-  <w:num w:numId="9" w16cid:durableId="2107380573">
-    <w:abstractNumId w:val="2"/>
+  <w:num w:numId="9" w16cid:durableId="60907910">
+    <w:abstractNumId w:val="7"/>
   </w:num>
 </w:numbering>
 </file>

</xml_diff>

<commit_message>
docs: over-the-air updates, offline capture rules and the OTA env-var trap
- DEPLOY.md documents the eas update workflow, the requirement that the Supabase
  values live on EAS as environment variables (a plain .env is not enough for
  eas update), how to inspect a published bundle, and eas update:rollback.
- PROJECT_REPORT.md/.docx: new build id and versionCode, OTA row in the
  deployment table, the caught-before-shipping OTA story in the engineering
  journey, and verification rows for both delivery paths.
- README: offline capture behaviour, in-app updates, notifications while open.
</commit_message>
<xml_diff>
--- a/docs/PROJECT_REPORT.docx
+++ b/docs/PROJECT_REPORT.docx
@@ -194,7 +194,7 @@
           <w:sz w:val="22"/>
           <w:szCs w:val="22"/>
         </w:rPr>
-        <w:pict w14:anchorId="3CC84C74">
+        <w:pict w14:anchorId="749F5AF1">
           <v:rect id="_x0000_i1025" style="width:0;height:1.5pt" o:hralign="center" o:hrstd="t" o:hr="t" fillcolor="#a0a0a0" stroked="f"/>
         </w:pict>
       </w:r>
@@ -1044,7 +1044,7 @@
           <w:rStyle w:val="HTMLCode"/>
           <w:color w:val="1A1A1A"/>
         </w:rPr>
-        <w:t>faa3abd0</w:t>
+        <w:t>a093df69</w:t>
       </w:r>
       <w:r>
         <w:rPr>
@@ -1085,7 +1085,42 @@
           <w:sz w:val="22"/>
           <w:szCs w:val="22"/>
         </w:rPr>
-        <w:t>, app version 2.0.0.</w:t>
+        <w:t xml:space="preserve">, app version 2.0.0, versionCode 2. The app also supports </w:t>
+      </w:r>
+      <w:r>
+        <w:rPr>
+          <w:rStyle w:val="Strong"/>
+          <w:rFonts w:ascii="Calibri" w:eastAsia="Times New Roman" w:hAnsi="Calibri" w:cs="Calibri"/>
+          <w:color w:val="1A1A1A"/>
+          <w:sz w:val="22"/>
+          <w:szCs w:val="22"/>
+        </w:rPr>
+        <w:t>over-the-air updates</w:t>
+      </w:r>
+      <w:r>
+        <w:rPr>
+          <w:rFonts w:ascii="Calibri" w:eastAsia="Times New Roman" w:hAnsi="Calibri" w:cs="Calibri"/>
+          <w:color w:val="1A1A1A"/>
+          <w:sz w:val="22"/>
+          <w:szCs w:val="22"/>
+        </w:rPr>
+        <w:t xml:space="preserve"> (expo-updates), so later JavaScript changes reach an installed phone through </w:t>
+      </w:r>
+      <w:r>
+        <w:rPr>
+          <w:rStyle w:val="HTMLCode"/>
+          <w:color w:val="1A1A1A"/>
+        </w:rPr>
+        <w:t>eas update</w:t>
+      </w:r>
+      <w:r>
+        <w:rPr>
+          <w:rFonts w:ascii="Calibri" w:eastAsia="Times New Roman" w:hAnsi="Calibri" w:cs="Calibri"/>
+          <w:color w:val="1A1A1A"/>
+          <w:sz w:val="22"/>
+          <w:szCs w:val="22"/>
+        </w:rPr>
+        <w:t xml:space="preserve"> without a new APK.</w:t>
       </w:r>
     </w:p>
     <w:p>
@@ -1175,7 +1210,16 @@
           <w:sz w:val="22"/>
           <w:szCs w:val="22"/>
         </w:rPr>
-        <w:t xml:space="preserve"> schema, 5 monitoring zones, 3 role-correct profiles, 71 demo records and 40 worker notifications all present and verified over the production REST API.</w:t>
+        <w:t xml:space="preserve"> schema, 5 monitoring zones, 3 role-correct profiles, 71 demo records and </w:t>
+      </w:r>
+      <w:r>
+        <w:rPr>
+          <w:rFonts w:ascii="Calibri" w:eastAsia="Times New Roman" w:hAnsi="Calibri" w:cs="Calibri"/>
+          <w:color w:val="1A1A1A"/>
+          <w:sz w:val="22"/>
+          <w:szCs w:val="22"/>
+        </w:rPr>
+        <w:t>40 worker notifications all present and verified over the production REST API.</w:t>
       </w:r>
     </w:p>
     <w:p>
@@ -1199,6 +1243,7 @@
           <w:sz w:val="22"/>
           <w:szCs w:val="22"/>
         </w:rPr>
+        <w:lastRenderedPageBreak/>
         <w:t>All 21 commits pushed; working tree clean.</w:t>
       </w:r>
     </w:p>
@@ -1219,8 +1264,7 @@
           <w:sz w:val="22"/>
           <w:szCs w:val="22"/>
         </w:rPr>
-        <w:lastRenderedPageBreak/>
-        <w:pict w14:anchorId="6B29E457">
+        <w:pict w14:anchorId="2070D2D4">
           <v:rect id="_x0000_i1026" style="width:0;height:1.5pt" o:hralign="center" o:hrstd="t" o:hr="t" fillcolor="#a0a0a0" stroked="f"/>
         </w:pict>
       </w:r>
@@ -1310,7 +1354,16 @@
           <w:sz w:val="22"/>
           <w:szCs w:val="22"/>
         </w:rPr>
-        <w:t xml:space="preserve"> → offline-first capture with drafts and an upload outbox.</w:t>
+        <w:t xml:space="preserve"> </w:t>
+      </w:r>
+      <w:r>
+        <w:rPr>
+          <w:rFonts w:ascii="Calibri" w:eastAsia="Times New Roman" w:hAnsi="Calibri" w:cs="Calibri"/>
+          <w:color w:val="1A1A1A"/>
+          <w:sz w:val="22"/>
+          <w:szCs w:val="22"/>
+        </w:rPr>
+        <w:t>→ offline-first capture with drafts and an upload outbox.</w:t>
       </w:r>
     </w:p>
     <w:p>
@@ -1344,16 +1397,7 @@
           <w:sz w:val="22"/>
           <w:szCs w:val="22"/>
         </w:rPr>
-        <w:t xml:space="preserve"> → three fixed record types (flora &amp; biodiversity, soil &amp; </w:t>
-      </w:r>
-      <w:r>
-        <w:rPr>
-          <w:rFonts w:ascii="Calibri" w:eastAsia="Times New Roman" w:hAnsi="Calibri" w:cs="Calibri"/>
-          <w:color w:val="1A1A1A"/>
-          <w:sz w:val="22"/>
-          <w:szCs w:val="22"/>
-        </w:rPr>
-        <w:t>water, environmental hazard) with type-specific fields.</w:t>
+        <w:t xml:space="preserve"> → three fixed record types (flora &amp; biodiversity, soil &amp; water, environmental hazard) with type-specific fields.</w:t>
       </w:r>
     </w:p>
     <w:p>
@@ -1475,7 +1519,7 @@
           <w:sz w:val="22"/>
           <w:szCs w:val="22"/>
         </w:rPr>
-        <w:pict w14:anchorId="4129D484">
+        <w:pict w14:anchorId="2354CB7C">
           <v:rect id="_x0000_i1027" style="width:0;height:1.5pt" o:hralign="center" o:hrstd="t" o:hr="t" fillcolor="#a0a0a0" stroked="f"/>
         </w:pict>
       </w:r>
@@ -1557,9 +1601,12 @@
           <w:szCs w:val="19"/>
           <w:shd w:val="clear" w:color="auto" w:fill="F0F4F1"/>
         </w:rPr>
-        <w:t xml:space="preserve">│  </w:t>
-      </w:r>
-      <w:r>
+        <w:t>│  Expo / React Native    │        │  Next.js (Vercel)        │</w:t>
+      </w:r>
+    </w:p>
+    <w:p>
+      <w:pPr>
+        <w:pStyle w:val="HTMLPreformatted"/>
         <w:rPr>
           <w:rFonts w:ascii="Consolas" w:hAnsi="Consolas"/>
           <w:color w:val="1A1A1A"/>
@@ -1567,12 +1614,8 @@
           <w:szCs w:val="19"/>
           <w:shd w:val="clear" w:color="auto" w:fill="F0F4F1"/>
         </w:rPr>
-        <w:t>Expo / React Native    │        │  Next.js (Vercel)        │</w:t>
-      </w:r>
-    </w:p>
-    <w:p>
-      <w:pPr>
-        <w:pStyle w:val="HTMLPreformatted"/>
+      </w:pPr>
+      <w:r>
         <w:rPr>
           <w:rFonts w:ascii="Consolas" w:hAnsi="Consolas"/>
           <w:color w:val="1A1A1A"/>
@@ -1580,8 +1623,12 @@
           <w:szCs w:val="19"/>
           <w:shd w:val="clear" w:color="auto" w:fill="F0F4F1"/>
         </w:rPr>
-      </w:pPr>
-      <w:r>
+        <w:t>│  ┌───────────────┐      │        │  ┌────────────────────┐  │</w:t>
+      </w:r>
+    </w:p>
+    <w:p>
+      <w:pPr>
+        <w:pStyle w:val="HTMLPreformatted"/>
         <w:rPr>
           <w:rFonts w:ascii="Consolas" w:hAnsi="Consolas"/>
           <w:color w:val="1A1A1A"/>
@@ -1589,12 +1636,8 @@
           <w:szCs w:val="19"/>
           <w:shd w:val="clear" w:color="auto" w:fill="F0F4F1"/>
         </w:rPr>
-        <w:t>│  ┌───────────────┐      │        │  ┌────────────────────┐  │</w:t>
-      </w:r>
-    </w:p>
-    <w:p>
-      <w:pPr>
-        <w:pStyle w:val="HTMLPreformatted"/>
+      </w:pPr>
+      <w:r>
         <w:rPr>
           <w:rFonts w:ascii="Consolas" w:hAnsi="Consolas"/>
           <w:color w:val="1A1A1A"/>
@@ -1602,8 +1645,12 @@
           <w:szCs w:val="19"/>
           <w:shd w:val="clear" w:color="auto" w:fill="F0F4F1"/>
         </w:rPr>
-      </w:pPr>
-      <w:r>
+        <w:t>│  UI screens     │      │        │  Dashboard / Records / │  │</w:t>
+      </w:r>
+    </w:p>
+    <w:p>
+      <w:pPr>
+        <w:pStyle w:val="HTMLPreformatted"/>
         <w:rPr>
           <w:rFonts w:ascii="Consolas" w:hAnsi="Consolas"/>
           <w:color w:val="1A1A1A"/>
@@ -1611,12 +1658,8 @@
           <w:szCs w:val="19"/>
           <w:shd w:val="clear" w:color="auto" w:fill="F0F4F1"/>
         </w:rPr>
-        <w:t>│  UI screens     │      │        │  Dashboard / Records / │  │</w:t>
-      </w:r>
-    </w:p>
-    <w:p>
-      <w:pPr>
-        <w:pStyle w:val="HTMLPreformatted"/>
+      </w:pPr>
+      <w:r>
         <w:rPr>
           <w:rFonts w:ascii="Consolas" w:hAnsi="Consolas"/>
           <w:color w:val="1A1A1A"/>
@@ -1624,8 +1667,12 @@
           <w:szCs w:val="19"/>
           <w:shd w:val="clear" w:color="auto" w:fill="F0F4F1"/>
         </w:rPr>
-      </w:pPr>
-      <w:r>
+        <w:t>│  AuthContext    │      │        │  Map / Users / Zones   │  │</w:t>
+      </w:r>
+    </w:p>
+    <w:p>
+      <w:pPr>
+        <w:pStyle w:val="HTMLPreformatted"/>
         <w:rPr>
           <w:rFonts w:ascii="Consolas" w:hAnsi="Consolas"/>
           <w:color w:val="1A1A1A"/>
@@ -1633,12 +1680,8 @@
           <w:szCs w:val="19"/>
           <w:shd w:val="clear" w:color="auto" w:fill="F0F4F1"/>
         </w:rPr>
-        <w:t>│  AuthContext    │      │        │  Map / Users / Zones   │  │</w:t>
-      </w:r>
-    </w:p>
-    <w:p>
-      <w:pPr>
-        <w:pStyle w:val="HTMLPreformatted"/>
+      </w:pPr>
+      <w:r>
         <w:rPr>
           <w:rFonts w:ascii="Consolas" w:hAnsi="Consolas"/>
           <w:color w:val="1A1A1A"/>
@@ -1646,8 +1689,12 @@
           <w:szCs w:val="19"/>
           <w:shd w:val="clear" w:color="auto" w:fill="F0F4F1"/>
         </w:rPr>
-      </w:pPr>
-      <w:r>
+        <w:t>│  ┌───────────────┐     │        │  ┌────────────────────┐ │  │</w:t>
+      </w:r>
+    </w:p>
+    <w:p>
+      <w:pPr>
+        <w:pStyle w:val="HTMLPreformatted"/>
         <w:rPr>
           <w:rFonts w:ascii="Consolas" w:hAnsi="Consolas"/>
           <w:color w:val="1A1A1A"/>
@@ -1655,12 +1702,8 @@
           <w:szCs w:val="19"/>
           <w:shd w:val="clear" w:color="auto" w:fill="F0F4F1"/>
         </w:rPr>
-        <w:t>│  ┌───────────────┐     │        │  ┌────────────────────┐ │  │</w:t>
-      </w:r>
-    </w:p>
-    <w:p>
-      <w:pPr>
-        <w:pStyle w:val="HTMLPreformatted"/>
+      </w:pPr>
+      <w:r>
         <w:rPr>
           <w:rFonts w:ascii="Consolas" w:hAnsi="Consolas"/>
           <w:color w:val="1A1A1A"/>
@@ -1668,7 +1711,8 @@
           <w:szCs w:val="19"/>
           <w:shd w:val="clear" w:color="auto" w:fill="F0F4F1"/>
         </w:rPr>
-      </w:pPr>
+        <w:t xml:space="preserve">│  expo-sqlite    │◄─►   │        │  Supabase JS (SSR     │ │  </w:t>
+      </w:r>
       <w:r>
         <w:rPr>
           <w:rFonts w:ascii="Consolas" w:hAnsi="Consolas"/>
@@ -1677,7 +1721,7 @@
           <w:szCs w:val="19"/>
           <w:shd w:val="clear" w:color="auto" w:fill="F0F4F1"/>
         </w:rPr>
-        <w:t>│  expo-sqlite    │◄─►   │        │  Supabase JS (SSR     │ │  │</w:t>
+        <w:t>│</w:t>
       </w:r>
     </w:p>
     <w:p>
@@ -1897,12 +1941,9 @@
           <w:szCs w:val="19"/>
           <w:shd w:val="clear" w:color="auto" w:fill="F0F4F1"/>
         </w:rPr>
-        <w:t xml:space="preserve">   │  zones · records · notifications · profiles      │</w:t>
-      </w:r>
-    </w:p>
-    <w:p>
-      <w:pPr>
-        <w:pStyle w:val="HTMLPreformatted"/>
+        <w:t xml:space="preserve">  </w:t>
+      </w:r>
+      <w:r>
         <w:rPr>
           <w:rFonts w:ascii="Consolas" w:hAnsi="Consolas"/>
           <w:color w:val="1A1A1A"/>
@@ -1910,8 +1951,12 @@
           <w:szCs w:val="19"/>
           <w:shd w:val="clear" w:color="auto" w:fill="F0F4F1"/>
         </w:rPr>
-      </w:pPr>
-      <w:r>
+        <w:t xml:space="preserve"> │  zones · records · notifications · profiles      │</w:t>
+      </w:r>
+    </w:p>
+    <w:p>
+      <w:pPr>
+        <w:pStyle w:val="HTMLPreformatted"/>
         <w:rPr>
           <w:rFonts w:ascii="Consolas" w:hAnsi="Consolas"/>
           <w:color w:val="1A1A1A"/>
@@ -1919,6 +1964,15 @@
           <w:szCs w:val="19"/>
           <w:shd w:val="clear" w:color="auto" w:fill="F0F4F1"/>
         </w:rPr>
+      </w:pPr>
+      <w:r>
+        <w:rPr>
+          <w:rFonts w:ascii="Consolas" w:hAnsi="Consolas"/>
+          <w:color w:val="1A1A1A"/>
+          <w:sz w:val="19"/>
+          <w:szCs w:val="19"/>
+          <w:shd w:val="clear" w:color="auto" w:fill="F0F4F1"/>
+        </w:rPr>
         <w:t xml:space="preserve">   └─────────────────────────────────────────────────┘</w:t>
       </w:r>
     </w:p>
@@ -1978,7 +2032,8 @@
           <w:sz w:val="22"/>
           <w:szCs w:val="22"/>
         </w:rPr>
-        <w:pict w14:anchorId="7CCAAFFB">
+        <w:lastRenderedPageBreak/>
+        <w:pict w14:anchorId="070F1DEE">
           <v:rect id="_x0000_i1028" style="width:0;height:1.5pt" o:hralign="center" o:hrstd="t" o:hr="t" fillcolor="#a0a0a0" stroked="f"/>
         </w:pict>
       </w:r>
@@ -1994,7 +2049,6 @@
         <w:rPr>
           <w:rFonts w:ascii="Calibri" w:eastAsia="Times New Roman" w:hAnsi="Calibri" w:cs="Calibri"/>
         </w:rPr>
-        <w:lastRenderedPageBreak/>
         <w:t>4. Feature inventory</w:t>
       </w:r>
     </w:p>
@@ -2502,7 +2556,35 @@
           <w:sz w:val="22"/>
           <w:szCs w:val="22"/>
         </w:rPr>
-        <w:t xml:space="preserve"> finished records go to an </w:t>
+        <w:t xml:space="preserve"> records and photos are written to the phone's own SQLite database </w:t>
+      </w:r>
+      <w:r>
+        <w:rPr>
+          <w:rFonts w:ascii="Calibri" w:hAnsi="Calibri" w:cs="Calibri"/>
+          <w:color w:val="1A1A1A"/>
+          <w:sz w:val="22"/>
+          <w:szCs w:val="22"/>
+        </w:rPr>
+        <w:t xml:space="preserve">first. When the phone is offline the app says so plainly and disables "Save record" (submitting needs the server), directing the worker to </w:t>
+      </w:r>
+      <w:r>
+        <w:rPr>
+          <w:rStyle w:val="Strong"/>
+          <w:rFonts w:ascii="Calibri" w:hAnsi="Calibri" w:cs="Calibri"/>
+          <w:color w:val="1A1A1A"/>
+          <w:sz w:val="22"/>
+          <w:szCs w:val="22"/>
+        </w:rPr>
+        <w:t>Save as draft</w:t>
+      </w:r>
+      <w:r>
+        <w:rPr>
+          <w:rFonts w:ascii="Calibri" w:hAnsi="Calibri" w:cs="Calibri"/>
+          <w:color w:val="1A1A1A"/>
+          <w:sz w:val="22"/>
+          <w:szCs w:val="22"/>
+        </w:rPr>
+        <w:t xml:space="preserve"> instead; the draft is reopened from My Records and submitted once there is signal. Anything already queued uploads automatically when connectivity returns (with a manual "Sync now"), and the signed-in profile is cached on the device so a cold start offline still works. Unfinished records park as </w:t>
       </w:r>
       <w:r>
         <w:rPr>
@@ -2511,24 +2593,6 @@
           <w:sz w:val="22"/>
           <w:szCs w:val="22"/>
         </w:rPr>
-        <w:t>outbox</w:t>
-      </w:r>
-      <w:r>
-        <w:rPr>
-          <w:rFonts w:ascii="Calibri" w:hAnsi="Calibri" w:cs="Calibri"/>
-          <w:color w:val="1A1A1A"/>
-          <w:sz w:val="22"/>
-          <w:szCs w:val="22"/>
-        </w:rPr>
-        <w:t xml:space="preserve"> and upload automatically when connectivity returns (with a manual "Sync now"); unfinished records park as </w:t>
-      </w:r>
-      <w:r>
-        <w:rPr>
-          <w:rStyle w:val="Emphasis"/>
-          <w:rFonts w:ascii="Calibri" w:hAnsi="Calibri" w:cs="Calibri"/>
-          <w:sz w:val="22"/>
-          <w:szCs w:val="22"/>
-        </w:rPr>
         <w:t>drafts</w:t>
       </w:r>
       <w:r>
@@ -2538,7 +2602,7 @@
           <w:sz w:val="22"/>
           <w:szCs w:val="22"/>
         </w:rPr>
-        <w:t xml:space="preserve"> and can be completed later from My Records.</w:t>
+        <w:t xml:space="preserve"> and can be completed later.</w:t>
       </w:r>
     </w:p>
     <w:p>
@@ -2562,16 +2626,7 @@
           <w:sz w:val="22"/>
           <w:szCs w:val="22"/>
         </w:rPr>
-        <w:t>My Records shows each record'</w:t>
-      </w:r>
-      <w:r>
-        <w:rPr>
-          <w:rFonts w:ascii="Calibri" w:hAnsi="Calibri" w:cs="Calibri"/>
-          <w:color w:val="1A1A1A"/>
-          <w:sz w:val="22"/>
-          <w:szCs w:val="22"/>
-        </w:rPr>
-        <w:t>s review status and the supervisor's comment.</w:t>
+        <w:t>My Records shows each record's review status and the supervisor's comment.</w:t>
       </w:r>
     </w:p>
     <w:p>
@@ -2638,7 +2693,60 @@
           <w:sz w:val="22"/>
           <w:szCs w:val="22"/>
         </w:rPr>
-        <w:t>Notifications inbox when a record is approved or rejected.</w:t>
+        <w:t xml:space="preserve">Notifications inbox when a record is approved or rejected, </w:t>
+      </w:r>
+      <w:r>
+        <w:rPr>
+          <w:rStyle w:val="Strong"/>
+          <w:rFonts w:ascii="Calibri" w:hAnsi="Calibri" w:cs="Calibri"/>
+          <w:color w:val="1A1A1A"/>
+          <w:sz w:val="22"/>
+          <w:szCs w:val="22"/>
+        </w:rPr>
+        <w:t>announced on the phone within about 20 seconds while the app is open</w:t>
+      </w:r>
+      <w:r>
+        <w:rPr>
+          <w:rFonts w:ascii="Calibri" w:hAnsi="Calibri" w:cs="Calibri"/>
+          <w:color w:val="1A1A1A"/>
+          <w:sz w:val="22"/>
+          <w:szCs w:val="22"/>
+        </w:rPr>
+        <w:t xml:space="preserve"> (the notification tab also carries an unread badge).</w:t>
+      </w:r>
+    </w:p>
+    <w:p>
+      <w:pPr>
+        <w:pStyle w:val="NormalWeb"/>
+        <w:numPr>
+          <w:ilvl w:val="0"/>
+          <w:numId w:val="3"/>
+        </w:numPr>
+        <w:rPr>
+          <w:rFonts w:ascii="Calibri" w:hAnsi="Calibri" w:cs="Calibri"/>
+          <w:color w:val="1A1A1A"/>
+          <w:sz w:val="22"/>
+          <w:szCs w:val="22"/>
+        </w:rPr>
+      </w:pPr>
+      <w:r>
+        <w:rPr>
+          <w:rStyle w:val="Strong"/>
+          <w:rFonts w:ascii="Calibri" w:hAnsi="Calibri" w:cs="Calibri"/>
+          <w:color w:val="1A1A1A"/>
+          <w:sz w:val="22"/>
+          <w:szCs w:val="22"/>
+        </w:rPr>
+        <w:t>In-app updates</w:t>
+      </w:r>
+      <w:r>
+        <w:rPr>
+          <w:rFonts w:ascii="Calibri" w:hAnsi="Calibri" w:cs="Calibri"/>
+          <w:color w:val="1A1A1A"/>
+          <w:sz w:val="22"/>
+          <w:szCs w:val="22"/>
+        </w:rPr>
+        <w:t xml:space="preserve"> (expo-updates / EAS Update): the Home screen has an "App updates" card with the installed version and a manual check, and JavaScript improvements can be published to installed phones without a new APK.</w:t>
       </w:r>
     </w:p>
     <w:p>
@@ -2748,6 +2856,7 @@
           <w:sz w:val="22"/>
           <w:szCs w:val="22"/>
         </w:rPr>
+        <w:lastRenderedPageBreak/>
         <w:t>Interactive Leaflet map of the site: records plotted over the monitoring zones.</w:t>
       </w:r>
     </w:p>
@@ -2806,16 +2915,7 @@
           <w:sz w:val="22"/>
           <w:szCs w:val="22"/>
         </w:rPr>
-        <w:t xml:space="preserve"> (administrators): permanently remove a record from the list or the record page, with a two-click confirmation; its photos and notifications are removed </w:t>
-      </w:r>
-      <w:r>
-        <w:rPr>
-          <w:rFonts w:ascii="Calibri" w:eastAsia="Times New Roman" w:hAnsi="Calibri" w:cs="Calibri"/>
-          <w:color w:val="1A1A1A"/>
-          <w:sz w:val="22"/>
-          <w:szCs w:val="22"/>
-        </w:rPr>
-        <w:t>with it.</w:t>
+        <w:t xml:space="preserve"> (administrators): permanently remove a record from the list or the record page, with a two-click confirmation; its photos and notifications are removed with it.</w:t>
       </w:r>
     </w:p>
     <w:p>
@@ -2941,7 +3041,6 @@
           <w:sz w:val="22"/>
           <w:szCs w:val="22"/>
         </w:rPr>
-        <w:lastRenderedPageBreak/>
         <w:t>PostgreSQL schema with 4 domain tables and 1 storage bucket (</w:t>
       </w:r>
       <w:r>
@@ -3193,7 +3292,7 @@
           <w:sz w:val="22"/>
           <w:szCs w:val="22"/>
         </w:rPr>
-        <w:pict w14:anchorId="06CE1CD5">
+        <w:pict w14:anchorId="69FBEAAE">
           <v:rect id="_x0000_i1029" style="width:0;height:1.5pt" o:hralign="center" o:hrstd="t" o:hr="t" fillcolor="#a0a0a0" stroked="f"/>
         </w:pict>
       </w:r>
@@ -3513,16 +3612,7 @@
                 <w:sz w:val="21"/>
                 <w:szCs w:val="21"/>
               </w:rPr>
-              <w:t>,</w:t>
-            </w:r>
-            <w:r>
-              <w:rPr>
-                <w:rFonts w:ascii="Calibri" w:eastAsia="Times New Roman" w:hAnsi="Calibri" w:cs="Calibri"/>
-                <w:color w:val="1A1A1A"/>
-                <w:sz w:val="21"/>
-                <w:szCs w:val="21"/>
-              </w:rPr>
-              <w:t xml:space="preserve"> </w:t>
+              <w:t xml:space="preserve">, </w:t>
             </w:r>
             <w:r>
               <w:rPr>
@@ -4065,7 +4155,7 @@
           <w:sz w:val="22"/>
           <w:szCs w:val="22"/>
         </w:rPr>
-        <w:pict w14:anchorId="2C34D98B">
+        <w:pict w14:anchorId="00671066">
           <v:rect id="_x0000_i1030" style="width:0;height:1.5pt" o:hralign="center" o:hrstd="t" o:hr="t" fillcolor="#a0a0a0" stroked="f"/>
         </w:pict>
       </w:r>
@@ -4081,6 +4171,7 @@
         <w:rPr>
           <w:rFonts w:ascii="Calibri" w:eastAsia="Times New Roman" w:hAnsi="Calibri" w:cs="Calibri"/>
         </w:rPr>
+        <w:lastRenderedPageBreak/>
         <w:t>6. Security model</w:t>
       </w:r>
     </w:p>
@@ -4115,16 +4206,7 @@
           <w:sz w:val="22"/>
           <w:szCs w:val="22"/>
         </w:rPr>
-        <w:t xml:space="preserve"> Supabase Auth (email/password). Sessions are persisted on the mobile </w:t>
-      </w:r>
-      <w:r>
-        <w:rPr>
-          <w:rFonts w:ascii="Calibri" w:eastAsia="Times New Roman" w:hAnsi="Calibri" w:cs="Calibri"/>
-          <w:color w:val="1A1A1A"/>
-          <w:sz w:val="22"/>
-          <w:szCs w:val="22"/>
-        </w:rPr>
-        <w:t>device and in SSR cookies on the web.</w:t>
+        <w:t xml:space="preserve"> Supabase Auth (email/password). Sessions are persisted on the mobile device and in SSR cookies on the web.</w:t>
       </w:r>
     </w:p>
     <w:p>
@@ -4158,7 +4240,16 @@
           <w:sz w:val="22"/>
           <w:szCs w:val="22"/>
         </w:rPr>
-        <w:t xml:space="preserve"> Row Level Security policies (02_policies.sql) are the enforcement point — a field worker can only see their own records and their own notifications; supervisors/admins see everything; deactivated users (</w:t>
+        <w:t xml:space="preserve"> Row Level Security policies (02_policies.sql) are the enforcement </w:t>
+      </w:r>
+      <w:r>
+        <w:rPr>
+          <w:rFonts w:ascii="Calibri" w:eastAsia="Times New Roman" w:hAnsi="Calibri" w:cs="Calibri"/>
+          <w:color w:val="1A1A1A"/>
+          <w:sz w:val="22"/>
+          <w:szCs w:val="22"/>
+        </w:rPr>
+        <w:t>point — a field worker can only see their own records and their own notifications; supervisors/admins see everything; deactivated users (</w:t>
       </w:r>
       <w:r>
         <w:rPr>
@@ -4199,7 +4290,6 @@
           <w:sz w:val="22"/>
           <w:szCs w:val="22"/>
         </w:rPr>
-        <w:lastRenderedPageBreak/>
         <w:t>Key hygiene:</w:t>
       </w:r>
       <w:r>
@@ -4246,16 +4336,7 @@
           <w:sz w:val="22"/>
           <w:szCs w:val="22"/>
         </w:rPr>
-        <w:t xml:space="preserve"> is required only for server-side admin actions (web "create user" </w:t>
-      </w:r>
-      <w:r>
-        <w:rPr>
-          <w:rFonts w:ascii="Calibri" w:eastAsia="Times New Roman" w:hAnsi="Calibri" w:cs="Calibri"/>
-          <w:color w:val="1A1A1A"/>
-          <w:sz w:val="22"/>
-          <w:szCs w:val="22"/>
-        </w:rPr>
-        <w:t>flows) and belongs in server-side env vars, never in the mobile app.</w:t>
+        <w:t xml:space="preserve"> is required only for server-side admin actions (web "create user" flows) and belongs in server-side env vars, never in the mobile app.</w:t>
       </w:r>
     </w:p>
     <w:p>
@@ -4289,7 +4370,16 @@
           <w:sz w:val="22"/>
           <w:szCs w:val="22"/>
         </w:rPr>
-        <w:t xml:space="preserve"> records stored locally in SQLite while offline are uploaded on reconnect under the signed-in user's identity; RLS validates every insert server-side.</w:t>
+        <w:t xml:space="preserve"> </w:t>
+      </w:r>
+      <w:r>
+        <w:rPr>
+          <w:rFonts w:ascii="Calibri" w:eastAsia="Times New Roman" w:hAnsi="Calibri" w:cs="Calibri"/>
+          <w:color w:val="1A1A1A"/>
+          <w:sz w:val="22"/>
+          <w:szCs w:val="22"/>
+        </w:rPr>
+        <w:t>records stored locally in SQLite while offline are uploaded on reconnect under the signed-in user's identity; RLS validates every insert server-side.</w:t>
       </w:r>
     </w:p>
     <w:p>
@@ -4309,7 +4399,7 @@
           <w:sz w:val="22"/>
           <w:szCs w:val="22"/>
         </w:rPr>
-        <w:pict w14:anchorId="028A6BE3">
+        <w:pict w14:anchorId="0CECBDD9">
           <v:rect id="_x0000_i1031" style="width:0;height:1.5pt" o:hralign="center" o:hrstd="t" o:hr="t" fillcolor="#a0a0a0" stroked="f"/>
         </w:pict>
       </w:r>
@@ -4340,9 +4430,9 @@
         <w:tblLook w:val="04A0" w:firstRow="1" w:lastRow="0" w:firstColumn="1" w:lastColumn="0" w:noHBand="0" w:noVBand="1"/>
       </w:tblPr>
       <w:tblGrid>
-        <w:gridCol w:w="1495"/>
-        <w:gridCol w:w="1898"/>
-        <w:gridCol w:w="5951"/>
+        <w:gridCol w:w="1475"/>
+        <w:gridCol w:w="1630"/>
+        <w:gridCol w:w="6239"/>
       </w:tblGrid>
       <w:tr>
         <w:trPr>
@@ -4625,6 +4715,264 @@
                 <w:szCs w:val="21"/>
               </w:rPr>
               <w:t xml:space="preserve"> → AAB for Play publishing</w:t>
+            </w:r>
+          </w:p>
+        </w:tc>
+      </w:tr>
+      <w:tr>
+        <w:tc>
+          <w:tcPr>
+            <w:tcW w:w="0" w:type="auto"/>
+            <w:tcBorders>
+              <w:top w:val="single" w:sz="6" w:space="0" w:color="BBBBBB"/>
+              <w:left w:val="single" w:sz="6" w:space="0" w:color="BBBBBB"/>
+              <w:bottom w:val="single" w:sz="6" w:space="0" w:color="BBBBBB"/>
+              <w:right w:val="single" w:sz="6" w:space="0" w:color="BBBBBB"/>
+            </w:tcBorders>
+            <w:tcMar>
+              <w:top w:w="75" w:type="dxa"/>
+              <w:left w:w="135" w:type="dxa"/>
+              <w:bottom w:w="75" w:type="dxa"/>
+              <w:right w:w="135" w:type="dxa"/>
+            </w:tcMar>
+            <w:hideMark/>
+          </w:tcPr>
+          <w:p>
+            <w:pPr>
+              <w:spacing w:before="150" w:after="150"/>
+              <w:rPr>
+                <w:rFonts w:ascii="Calibri" w:eastAsia="Times New Roman" w:hAnsi="Calibri" w:cs="Calibri"/>
+                <w:color w:val="1A1A1A"/>
+                <w:sz w:val="21"/>
+                <w:szCs w:val="21"/>
+              </w:rPr>
+            </w:pPr>
+            <w:r>
+              <w:rPr>
+                <w:rFonts w:ascii="Calibri" w:eastAsia="Times New Roman" w:hAnsi="Calibri" w:cs="Calibri"/>
+                <w:color w:val="1A1A1A"/>
+                <w:sz w:val="21"/>
+                <w:szCs w:val="21"/>
+              </w:rPr>
+              <w:t>Mobile over-the-air updates</w:t>
+            </w:r>
+          </w:p>
+        </w:tc>
+        <w:tc>
+          <w:tcPr>
+            <w:tcW w:w="0" w:type="auto"/>
+            <w:tcBorders>
+              <w:top w:val="single" w:sz="6" w:space="0" w:color="BBBBBB"/>
+              <w:left w:val="single" w:sz="6" w:space="0" w:color="BBBBBB"/>
+              <w:bottom w:val="single" w:sz="6" w:space="0" w:color="BBBBBB"/>
+              <w:right w:val="single" w:sz="6" w:space="0" w:color="BBBBBB"/>
+            </w:tcBorders>
+            <w:tcMar>
+              <w:top w:w="75" w:type="dxa"/>
+              <w:left w:w="135" w:type="dxa"/>
+              <w:bottom w:w="75" w:type="dxa"/>
+              <w:right w:w="135" w:type="dxa"/>
+            </w:tcMar>
+            <w:hideMark/>
+          </w:tcPr>
+          <w:p>
+            <w:pPr>
+              <w:spacing w:before="150" w:after="150"/>
+              <w:rPr>
+                <w:rFonts w:ascii="Calibri" w:eastAsia="Times New Roman" w:hAnsi="Calibri" w:cs="Calibri"/>
+                <w:color w:val="1A1A1A"/>
+                <w:sz w:val="21"/>
+                <w:szCs w:val="21"/>
+              </w:rPr>
+            </w:pPr>
+            <w:r>
+              <w:rPr>
+                <w:rFonts w:ascii="Calibri" w:eastAsia="Times New Roman" w:hAnsi="Calibri" w:cs="Calibri"/>
+                <w:color w:val="1A1A1A"/>
+                <w:sz w:val="21"/>
+                <w:szCs w:val="21"/>
+              </w:rPr>
+              <w:t>EAS Update (expo-updates)</w:t>
+            </w:r>
+          </w:p>
+        </w:tc>
+        <w:tc>
+          <w:tcPr>
+            <w:tcW w:w="0" w:type="auto"/>
+            <w:tcBorders>
+              <w:top w:val="single" w:sz="6" w:space="0" w:color="BBBBBB"/>
+              <w:left w:val="single" w:sz="6" w:space="0" w:color="BBBBBB"/>
+              <w:bottom w:val="single" w:sz="6" w:space="0" w:color="BBBBBB"/>
+              <w:right w:val="single" w:sz="6" w:space="0" w:color="BBBBBB"/>
+            </w:tcBorders>
+            <w:tcMar>
+              <w:top w:w="75" w:type="dxa"/>
+              <w:left w:w="135" w:type="dxa"/>
+              <w:bottom w:w="75" w:type="dxa"/>
+              <w:right w:w="135" w:type="dxa"/>
+            </w:tcMar>
+            <w:hideMark/>
+          </w:tcPr>
+          <w:p>
+            <w:pPr>
+              <w:spacing w:before="150" w:after="150"/>
+              <w:rPr>
+                <w:rFonts w:ascii="Calibri" w:eastAsia="Times New Roman" w:hAnsi="Calibri" w:cs="Calibri"/>
+                <w:color w:val="1A1A1A"/>
+                <w:sz w:val="21"/>
+                <w:szCs w:val="21"/>
+              </w:rPr>
+            </w:pPr>
+            <w:r>
+              <w:rPr>
+                <w:rFonts w:ascii="Calibri" w:eastAsia="Times New Roman" w:hAnsi="Calibri" w:cs="Calibri"/>
+                <w:color w:val="1A1A1A"/>
+                <w:sz w:val="21"/>
+                <w:szCs w:val="21"/>
+              </w:rPr>
+              <w:t xml:space="preserve">build channels </w:t>
+            </w:r>
+            <w:r>
+              <w:rPr>
+                <w:rStyle w:val="HTMLCode"/>
+                <w:color w:val="1A1A1A"/>
+              </w:rPr>
+              <w:t>preview</w:t>
+            </w:r>
+            <w:r>
+              <w:rPr>
+                <w:rFonts w:ascii="Calibri" w:eastAsia="Times New Roman" w:hAnsi="Calibri" w:cs="Calibri"/>
+                <w:color w:val="1A1A1A"/>
+                <w:sz w:val="21"/>
+                <w:szCs w:val="21"/>
+              </w:rPr>
+              <w:t xml:space="preserve"> / </w:t>
+            </w:r>
+            <w:r>
+              <w:rPr>
+                <w:rStyle w:val="HTMLCode"/>
+                <w:color w:val="1A1A1A"/>
+              </w:rPr>
+              <w:t>production</w:t>
+            </w:r>
+            <w:r>
+              <w:rPr>
+                <w:rFonts w:ascii="Calibri" w:eastAsia="Times New Roman" w:hAnsi="Calibri" w:cs="Calibri"/>
+                <w:color w:val="1A1A1A"/>
+                <w:sz w:val="21"/>
+                <w:szCs w:val="21"/>
+              </w:rPr>
+              <w:t xml:space="preserve">; </w:t>
+            </w:r>
+            <w:r>
+              <w:rPr>
+                <w:rStyle w:val="HTMLCode"/>
+                <w:color w:val="1A1A1A"/>
+              </w:rPr>
+              <w:t>eas update --channel preview</w:t>
+            </w:r>
+            <w:r>
+              <w:rPr>
+                <w:rFonts w:ascii="Calibri" w:eastAsia="Times New Roman" w:hAnsi="Calibri" w:cs="Calibri"/>
+                <w:color w:val="1A1A1A"/>
+                <w:sz w:val="21"/>
+                <w:szCs w:val="21"/>
+              </w:rPr>
+              <w:t xml:space="preserve"> </w:t>
+            </w:r>
+            <w:r>
+              <w:rPr>
+                <w:rFonts w:ascii="Calibri" w:eastAsia="Times New Roman" w:hAnsi="Calibri" w:cs="Calibri"/>
+                <w:color w:val="1A1A1A"/>
+                <w:sz w:val="21"/>
+                <w:szCs w:val="21"/>
+              </w:rPr>
+              <w:t xml:space="preserve">publishes JavaScript changes to installed phones, which pick them up on next launch or via </w:t>
+            </w:r>
+            <w:r>
+              <w:rPr>
+                <w:rStyle w:val="Strong"/>
+                <w:rFonts w:ascii="Calibri" w:eastAsia="Times New Roman" w:hAnsi="Calibri" w:cs="Calibri"/>
+                <w:color w:val="1A1A1A"/>
+                <w:sz w:val="21"/>
+                <w:szCs w:val="21"/>
+              </w:rPr>
+              <w:t>Home → App updates → Check for updates</w:t>
+            </w:r>
+            <w:r>
+              <w:rPr>
+                <w:rFonts w:ascii="Calibri" w:eastAsia="Times New Roman" w:hAnsi="Calibri" w:cs="Calibri"/>
+                <w:color w:val="1A1A1A"/>
+                <w:sz w:val="21"/>
+                <w:szCs w:val="21"/>
+              </w:rPr>
+              <w:t xml:space="preserve">. Native changes still require a new build. The Supabase values are stored as EAS </w:t>
+            </w:r>
+            <w:r>
+              <w:rPr>
+                <w:rStyle w:val="Emphasis"/>
+                <w:rFonts w:ascii="Calibri" w:eastAsia="Times New Roman" w:hAnsi="Calibri" w:cs="Calibri"/>
+                <w:sz w:val="21"/>
+                <w:szCs w:val="21"/>
+              </w:rPr>
+              <w:t>environment variables</w:t>
+            </w:r>
+            <w:r>
+              <w:rPr>
+                <w:rFonts w:ascii="Calibri" w:eastAsia="Times New Roman" w:hAnsi="Calibri" w:cs="Calibri"/>
+                <w:color w:val="1A1A1A"/>
+                <w:sz w:val="21"/>
+                <w:szCs w:val="21"/>
+              </w:rPr>
+              <w:t xml:space="preserve"> for </w:t>
+            </w:r>
+            <w:r>
+              <w:rPr>
+                <w:rStyle w:val="HTMLCode"/>
+                <w:color w:val="1A1A1A"/>
+              </w:rPr>
+              <w:t>preview</w:t>
+            </w:r>
+            <w:r>
+              <w:rPr>
+                <w:rFonts w:ascii="Calibri" w:eastAsia="Times New Roman" w:hAnsi="Calibri" w:cs="Calibri"/>
+                <w:color w:val="1A1A1A"/>
+                <w:sz w:val="21"/>
+                <w:szCs w:val="21"/>
+              </w:rPr>
+              <w:t xml:space="preserve"> and </w:t>
+            </w:r>
+            <w:r>
+              <w:rPr>
+                <w:rStyle w:val="HTMLCode"/>
+                <w:color w:val="1A1A1A"/>
+              </w:rPr>
+              <w:t>production</w:t>
+            </w:r>
+            <w:r>
+              <w:rPr>
+                <w:rFonts w:ascii="Calibri" w:eastAsia="Times New Roman" w:hAnsi="Calibri" w:cs="Calibri"/>
+                <w:color w:val="1A1A1A"/>
+                <w:sz w:val="21"/>
+                <w:szCs w:val="21"/>
+              </w:rPr>
+              <w:t xml:space="preserve"> (not only in </w:t>
+            </w:r>
+            <w:r>
+              <w:rPr>
+                <w:rStyle w:val="HTMLCode"/>
+                <w:color w:val="1A1A1A"/>
+              </w:rPr>
+              <w:t>mobile/.env</w:t>
+            </w:r>
+            <w:r>
+              <w:rPr>
+                <w:rFonts w:ascii="Calibri" w:eastAsia="Times New Roman" w:hAnsi="Calibri" w:cs="Calibri"/>
+                <w:color w:val="1A1A1A"/>
+                <w:sz w:val="21"/>
+                <w:szCs w:val="21"/>
+              </w:rPr>
+              <w:t>), so published bundles carry the backend config.</w:t>
             </w:r>
           </w:p>
         </w:tc>
@@ -4998,6 +5346,7 @@
                 <w:sz w:val="21"/>
                 <w:szCs w:val="21"/>
               </w:rPr>
+              <w:lastRenderedPageBreak/>
               <w:t>Account</w:t>
             </w:r>
           </w:p>
@@ -5501,16 +5850,7 @@
           <w:sz w:val="22"/>
           <w:szCs w:val="22"/>
         </w:rPr>
-        <w:t xml:space="preserve"> </w:t>
-      </w:r>
-      <w:r>
-        <w:rPr>
-          <w:rFonts w:ascii="Calibri" w:hAnsi="Calibri" w:cs="Calibri"/>
-          <w:color w:val="1A1A1A"/>
-          <w:sz w:val="22"/>
-          <w:szCs w:val="22"/>
-        </w:rPr>
-        <w:t xml:space="preserve">project linked as </w:t>
+        <w:t xml:space="preserve"> project linked as </w:t>
       </w:r>
       <w:r>
         <w:rPr>
@@ -5578,8 +5918,7 @@
           <w:sz w:val="22"/>
           <w:szCs w:val="22"/>
         </w:rPr>
-        <w:lastRenderedPageBreak/>
-        <w:pict w14:anchorId="13599465">
+        <w:pict w14:anchorId="713BE86D">
           <v:rect id="_x0000_i1032" style="width:0;height:1.5pt" o:hralign="center" o:hrstd="t" o:hr="t" fillcolor="#a0a0a0" stroked="f"/>
         </w:pict>
       </w:r>
@@ -5668,16 +6007,7 @@
           <w:sz w:val="22"/>
           <w:szCs w:val="22"/>
         </w:rPr>
-        <w:t xml:space="preserve"> </w:t>
-      </w:r>
-      <w:r>
-        <w:rPr>
-          <w:rFonts w:ascii="Calibri" w:hAnsi="Calibri" w:cs="Calibri"/>
-          <w:color w:val="1A1A1A"/>
-          <w:sz w:val="22"/>
-          <w:szCs w:val="22"/>
-        </w:rPr>
-        <w:t xml:space="preserve">The project lives inside OneDrive, where </w:t>
+        <w:t xml:space="preserve"> The project lives inside OneDrive, where </w:t>
       </w:r>
       <w:r>
         <w:rPr>
@@ -5709,7 +6039,16 @@
           <w:sz w:val="22"/>
           <w:szCs w:val="22"/>
         </w:rPr>
-        <w:t xml:space="preserve"> are replaced with junctions (see </w:t>
+        <w:t xml:space="preserve"> are replaced with</w:t>
+      </w:r>
+      <w:r>
+        <w:rPr>
+          <w:rFonts w:ascii="Calibri" w:hAnsi="Calibri" w:cs="Calibri"/>
+          <w:color w:val="1A1A1A"/>
+          <w:sz w:val="22"/>
+          <w:szCs w:val="22"/>
+        </w:rPr>
+        <w:t xml:space="preserve"> junctions (see </w:t>
       </w:r>
       <w:r>
         <w:rPr>
@@ -5859,16 +6198,7 @@
           <w:sz w:val="22"/>
           <w:szCs w:val="22"/>
         </w:rPr>
-        <w:t xml:space="preserve"> </w:t>
-      </w:r>
-      <w:r>
-        <w:rPr>
-          <w:rFonts w:ascii="Calibri" w:hAnsi="Calibri" w:cs="Calibri"/>
-          <w:color w:val="1A1A1A"/>
-          <w:sz w:val="22"/>
-          <w:szCs w:val="22"/>
-        </w:rPr>
-        <w:t xml:space="preserve">implementation. Documented in </w:t>
+        <w:t xml:space="preserve"> implementation. Documented in </w:t>
       </w:r>
       <w:r>
         <w:rPr>
@@ -6017,16 +6347,7 @@
           <w:sz w:val="22"/>
           <w:szCs w:val="22"/>
         </w:rPr>
-        <w:t xml:space="preserve"> to the plugin config and regenerate the splash asset (monogram on transparent ground). Second build — success. </w:t>
-      </w:r>
-      <w:r>
-        <w:rPr>
-          <w:rFonts w:ascii="Calibri" w:hAnsi="Calibri" w:cs="Calibri"/>
-          <w:color w:val="1A1A1A"/>
-          <w:sz w:val="22"/>
-          <w:szCs w:val="22"/>
-        </w:rPr>
-        <w:t xml:space="preserve">(This is also why "expert mode" matters: fetching cloud logs via </w:t>
+        <w:t xml:space="preserve"> to the plugin config and regenerate the splash asset (monogram on transparent ground). Second build — success. (This is also why "expert mode" matters: fetching cloud logs via </w:t>
       </w:r>
       <w:r>
         <w:rPr>
@@ -6058,7 +6379,16 @@
           <w:sz w:val="22"/>
           <w:szCs w:val="22"/>
         </w:rPr>
-        <w:t xml:space="preserve"> gave the exact Gradle error, and everything else in the log was deprecation noise.)</w:t>
+        <w:t xml:space="preserve"> </w:t>
+      </w:r>
+      <w:r>
+        <w:rPr>
+          <w:rFonts w:ascii="Calibri" w:hAnsi="Calibri" w:cs="Calibri"/>
+          <w:color w:val="1A1A1A"/>
+          <w:sz w:val="22"/>
+          <w:szCs w:val="22"/>
+        </w:rPr>
+        <w:t>gave the exact Gradle error, and everything else in the log was deprecation noise.)</w:t>
       </w:r>
     </w:p>
     <w:p>
@@ -6197,7 +6527,16 @@
           <w:sz w:val="22"/>
           <w:szCs w:val="22"/>
         </w:rPr>
-        <w:t xml:space="preserve"> for a populated demo. </w:t>
+        <w:t xml:space="preserve"> </w:t>
+      </w:r>
+      <w:r>
+        <w:rPr>
+          <w:rFonts w:ascii="Calibri" w:hAnsi="Calibri" w:cs="Calibri"/>
+          <w:color w:val="1A1A1A"/>
+          <w:sz w:val="22"/>
+          <w:szCs w:val="22"/>
+        </w:rPr>
+        <w:t xml:space="preserve">for a populated demo. </w:t>
       </w:r>
       <w:r>
         <w:rPr>
@@ -6268,16 +6607,7 @@
           <w:sz w:val="22"/>
           <w:szCs w:val="22"/>
         </w:rPr>
-        <w:t xml:space="preserve"> Initial REST probes returned HTTP 404 for zones/profiles/records. Node showed the actual PostgREST error body and a </w:t>
-      </w:r>
-      <w:r>
-        <w:rPr>
-          <w:rFonts w:ascii="Calibri" w:hAnsi="Calibri" w:cs="Calibri"/>
-          <w:color w:val="1A1A1A"/>
-          <w:sz w:val="22"/>
-          <w:szCs w:val="22"/>
-        </w:rPr>
-        <w:t xml:space="preserve">re-probe returned 200: the SQL had landed in the meantime. Worth noting for future diagnostics: </w:t>
+        <w:t xml:space="preserve"> Initial REST probes returned HTTP 404 for zones/profiles/records. Node showed the actual PostgREST error body and a re-probe returned 200: the SQL had landed in the meantime. Worth noting for future diagnostics: </w:t>
       </w:r>
       <w:r>
         <w:rPr>
@@ -6296,7 +6626,457 @@
           <w:sz w:val="22"/>
           <w:szCs w:val="22"/>
         </w:rPr>
-        <w:t xml:space="preserve"> before trusting a status code — and remember RLS can return an empty list for a perfectly loaded table (notifications for the admin account read as 0 because scoped rows belong to the worker).</w:t>
+        <w:t xml:space="preserve"> before trusting a status code — and </w:t>
+      </w:r>
+      <w:r>
+        <w:rPr>
+          <w:rFonts w:ascii="Calibri" w:hAnsi="Calibri" w:cs="Calibri"/>
+          <w:color w:val="1A1A1A"/>
+          <w:sz w:val="22"/>
+          <w:szCs w:val="22"/>
+        </w:rPr>
+        <w:t>remember RLS can return an empty list for a perfectly loaded table (notifications for the admin account read as 0 because scoped rows belong to the worker).</w:t>
+      </w:r>
+    </w:p>
+    <w:p>
+      <w:pPr>
+        <w:pStyle w:val="NormalWeb"/>
+        <w:numPr>
+          <w:ilvl w:val="0"/>
+          <w:numId w:val="7"/>
+        </w:numPr>
+        <w:rPr>
+          <w:rFonts w:ascii="Calibri" w:hAnsi="Calibri" w:cs="Calibri"/>
+          <w:color w:val="1A1A1A"/>
+          <w:sz w:val="22"/>
+          <w:szCs w:val="22"/>
+        </w:rPr>
+      </w:pPr>
+      <w:r>
+        <w:rPr>
+          <w:rStyle w:val="Strong"/>
+          <w:rFonts w:ascii="Calibri" w:hAnsi="Calibri" w:cs="Calibri"/>
+          <w:color w:val="1A1A1A"/>
+          <w:sz w:val="22"/>
+          <w:szCs w:val="22"/>
+        </w:rPr>
+        <w:t>An over-the-air update that would have broken the app — caught before shipping.</w:t>
+      </w:r>
+      <w:r>
+        <w:rPr>
+          <w:rFonts w:ascii="Calibri" w:hAnsi="Calibri" w:cs="Calibri"/>
+          <w:color w:val="1A1A1A"/>
+          <w:sz w:val="22"/>
+          <w:szCs w:val="22"/>
+        </w:rPr>
+        <w:t xml:space="preserve"> With </w:t>
+      </w:r>
+      <w:r>
+        <w:rPr>
+          <w:rStyle w:val="HTMLCode"/>
+          <w:color w:val="1A1A1A"/>
+        </w:rPr>
+        <w:t>expo-updates</w:t>
+      </w:r>
+      <w:r>
+        <w:rPr>
+          <w:rFonts w:ascii="Calibri" w:hAnsi="Calibri" w:cs="Calibri"/>
+          <w:color w:val="1A1A1A"/>
+          <w:sz w:val="22"/>
+          <w:szCs w:val="22"/>
+        </w:rPr>
+        <w:t xml:space="preserve"> in place, the first </w:t>
+      </w:r>
+      <w:r>
+        <w:rPr>
+          <w:rStyle w:val="HTMLCode"/>
+          <w:color w:val="1A1A1A"/>
+        </w:rPr>
+        <w:t>eas update</w:t>
+      </w:r>
+      <w:r>
+        <w:rPr>
+          <w:rFonts w:ascii="Calibri" w:hAnsi="Calibri" w:cs="Calibri"/>
+          <w:color w:val="1A1A1A"/>
+          <w:sz w:val="22"/>
+          <w:szCs w:val="22"/>
+        </w:rPr>
+        <w:t xml:space="preserve"> published a bundle that had been exported </w:t>
+      </w:r>
+      <w:r>
+        <w:rPr>
+          <w:rStyle w:val="Strong"/>
+          <w:rFonts w:ascii="Calibri" w:hAnsi="Calibri" w:cs="Calibri"/>
+          <w:color w:val="1A1A1A"/>
+          <w:sz w:val="22"/>
+          <w:szCs w:val="22"/>
+        </w:rPr>
+        <w:t>without</w:t>
+      </w:r>
+      <w:r>
+        <w:rPr>
+          <w:rFonts w:ascii="Calibri" w:hAnsi="Calibri" w:cs="Calibri"/>
+          <w:color w:val="1A1A1A"/>
+          <w:sz w:val="22"/>
+          <w:szCs w:val="22"/>
+        </w:rPr>
+        <w:t xml:space="preserve"> </w:t>
+      </w:r>
+      <w:r>
+        <w:rPr>
+          <w:rStyle w:val="HTMLCode"/>
+          <w:color w:val="1A1A1A"/>
+        </w:rPr>
+        <w:t>EXPO_PUBLIC_SUPABASE_URL</w:t>
+      </w:r>
+      <w:r>
+        <w:rPr>
+          <w:rFonts w:ascii="Calibri" w:hAnsi="Calibri" w:cs="Calibri"/>
+          <w:color w:val="1A1A1A"/>
+          <w:sz w:val="22"/>
+          <w:szCs w:val="22"/>
+        </w:rPr>
+        <w:t xml:space="preserve"> / </w:t>
+      </w:r>
+      <w:r>
+        <w:rPr>
+          <w:rStyle w:val="HTMLCode"/>
+          <w:color w:val="1A1A1A"/>
+        </w:rPr>
+        <w:t>EXPO_PUBLIC_SUPABASE_ANON_KEY</w:t>
+      </w:r>
+      <w:r>
+        <w:rPr>
+          <w:rFonts w:ascii="Calibri" w:hAnsi="Calibri" w:cs="Calibri"/>
+          <w:color w:val="1A1A1A"/>
+          <w:sz w:val="22"/>
+          <w:szCs w:val="22"/>
+        </w:rPr>
+        <w:t xml:space="preserve">: the values lived in </w:t>
+      </w:r>
+      <w:r>
+        <w:rPr>
+          <w:rStyle w:val="HTMLCode"/>
+          <w:color w:val="1A1A1A"/>
+        </w:rPr>
+        <w:t>mobile/.env</w:t>
+      </w:r>
+      <w:r>
+        <w:rPr>
+          <w:rFonts w:ascii="Calibri" w:hAnsi="Calibri" w:cs="Calibri"/>
+          <w:color w:val="1A1A1A"/>
+          <w:sz w:val="22"/>
+          <w:szCs w:val="22"/>
+        </w:rPr>
+        <w:t xml:space="preserve"> (gitignored), while </w:t>
+      </w:r>
+      <w:r>
+        <w:rPr>
+          <w:rStyle w:val="HTMLCode"/>
+          <w:color w:val="1A1A1A"/>
+        </w:rPr>
+        <w:t>eas update</w:t>
+      </w:r>
+      <w:r>
+        <w:rPr>
+          <w:rFonts w:ascii="Calibri" w:hAnsi="Calibri" w:cs="Calibri"/>
+          <w:color w:val="1A1A1A"/>
+          <w:sz w:val="22"/>
+          <w:szCs w:val="22"/>
+        </w:rPr>
+        <w:t xml:space="preserve"> only injects </w:t>
+      </w:r>
+      <w:r>
+        <w:rPr>
+          <w:rStyle w:val="HTMLCode"/>
+          <w:color w:val="1A1A1A"/>
+        </w:rPr>
+        <w:t>EXPO_PUBLIC_*</w:t>
+      </w:r>
+      <w:r>
+        <w:rPr>
+          <w:rFonts w:ascii="Calibri" w:hAnsi="Calibri" w:cs="Calibri"/>
+          <w:color w:val="1A1A1A"/>
+          <w:sz w:val="22"/>
+          <w:szCs w:val="22"/>
+        </w:rPr>
+        <w:t xml:space="preserve"> from the </w:t>
+      </w:r>
+      <w:r>
+        <w:rPr>
+          <w:rStyle w:val="Strong"/>
+          <w:rFonts w:ascii="Calibri" w:hAnsi="Calibri" w:cs="Calibri"/>
+          <w:color w:val="1A1A1A"/>
+          <w:sz w:val="22"/>
+          <w:szCs w:val="22"/>
+        </w:rPr>
+        <w:t>EAS environment</w:t>
+      </w:r>
+      <w:r>
+        <w:rPr>
+          <w:rFonts w:ascii="Calibri" w:hAnsi="Calibri" w:cs="Calibri"/>
+          <w:color w:val="1A1A1A"/>
+          <w:sz w:val="22"/>
+          <w:szCs w:val="22"/>
+        </w:rPr>
+        <w:t xml:space="preserve"> </w:t>
+      </w:r>
+      <w:r>
+        <w:rPr>
+          <w:rFonts w:ascii="Calibri" w:hAnsi="Calibri" w:cs="Calibri"/>
+          <w:color w:val="1A1A1A"/>
+          <w:sz w:val="22"/>
+          <w:szCs w:val="22"/>
+        </w:rPr>
+        <w:t xml:space="preserve">named by </w:t>
+      </w:r>
+      <w:r>
+        <w:rPr>
+          <w:rStyle w:val="HTMLCode"/>
+          <w:color w:val="1A1A1A"/>
+        </w:rPr>
+        <w:t>--environment</w:t>
+      </w:r>
+      <w:r>
+        <w:rPr>
+          <w:rFonts w:ascii="Calibri" w:hAnsi="Calibri" w:cs="Calibri"/>
+          <w:color w:val="1A1A1A"/>
+          <w:sz w:val="22"/>
+          <w:szCs w:val="22"/>
+        </w:rPr>
+        <w:t>. The bundle was therefore code that could not reach the backend at all. Detection method, which is the reusable part: fetch the manifest the way an installed app does (</w:t>
+      </w:r>
+      <w:r>
+        <w:rPr>
+          <w:rStyle w:val="HTMLCode"/>
+          <w:color w:val="1A1A1A"/>
+        </w:rPr>
+        <w:t>u.expo.dev/&lt;projectId&gt;?channel-name=preview&amp;runtime-version=2.0.0&amp;platform=android</w:t>
+      </w:r>
+      <w:r>
+        <w:rPr>
+          <w:rFonts w:ascii="Calibri" w:hAnsi="Calibri" w:cs="Calibri"/>
+          <w:color w:val="1A1A1A"/>
+          <w:sz w:val="22"/>
+          <w:szCs w:val="22"/>
+        </w:rPr>
+        <w:t xml:space="preserve"> with </w:t>
+      </w:r>
+      <w:r>
+        <w:rPr>
+          <w:rStyle w:val="HTMLCode"/>
+          <w:color w:val="1A1A1A"/>
+        </w:rPr>
+        <w:t>expo-protocol-version: 1</w:t>
+      </w:r>
+      <w:r>
+        <w:rPr>
+          <w:rFonts w:ascii="Calibri" w:hAnsi="Calibri" w:cs="Calibri"/>
+          <w:color w:val="1A1A1A"/>
+          <w:sz w:val="22"/>
+          <w:szCs w:val="22"/>
+        </w:rPr>
+        <w:t xml:space="preserve">), read the </w:t>
+      </w:r>
+      <w:r>
+        <w:rPr>
+          <w:rStyle w:val="Strong"/>
+          <w:rFonts w:ascii="Calibri" w:hAnsi="Calibri" w:cs="Calibri"/>
+          <w:color w:val="1A1A1A"/>
+          <w:sz w:val="22"/>
+          <w:szCs w:val="22"/>
+        </w:rPr>
+        <w:t>multipart</w:t>
+      </w:r>
+      <w:r>
+        <w:rPr>
+          <w:rFonts w:ascii="Calibri" w:hAnsi="Calibri" w:cs="Calibri"/>
+          <w:color w:val="1A1A1A"/>
+          <w:sz w:val="22"/>
+          <w:szCs w:val="22"/>
+        </w:rPr>
+        <w:t xml:space="preserve"> body's </w:t>
+      </w:r>
+      <w:r>
+        <w:rPr>
+          <w:rStyle w:val="HTMLCode"/>
+          <w:color w:val="1A1A1A"/>
+        </w:rPr>
+        <w:t>manifest</w:t>
+      </w:r>
+      <w:r>
+        <w:rPr>
+          <w:rFonts w:ascii="Calibri" w:hAnsi="Calibri" w:cs="Calibri"/>
+          <w:color w:val="1A1A1A"/>
+          <w:sz w:val="22"/>
+          <w:szCs w:val="22"/>
+        </w:rPr>
+        <w:t xml:space="preserve"> part for </w:t>
+      </w:r>
+      <w:r>
+        <w:rPr>
+          <w:rStyle w:val="HTMLCode"/>
+          <w:color w:val="1A1A1A"/>
+        </w:rPr>
+        <w:t>launchAsset.url</w:t>
+      </w:r>
+      <w:r>
+        <w:rPr>
+          <w:rFonts w:ascii="Calibri" w:hAnsi="Calibri" w:cs="Calibri"/>
+          <w:color w:val="1A1A1A"/>
+          <w:sz w:val="22"/>
+          <w:szCs w:val="22"/>
+        </w:rPr>
+        <w:t xml:space="preserve"> and its </w:t>
+      </w:r>
+      <w:r>
+        <w:rPr>
+          <w:rStyle w:val="HTMLCode"/>
+          <w:color w:val="1A1A1A"/>
+        </w:rPr>
+        <w:t>extensions</w:t>
+      </w:r>
+      <w:r>
+        <w:rPr>
+          <w:rFonts w:ascii="Calibri" w:hAnsi="Calibri" w:cs="Calibri"/>
+          <w:color w:val="1A1A1A"/>
+          <w:sz w:val="22"/>
+          <w:szCs w:val="22"/>
+        </w:rPr>
+        <w:t xml:space="preserve"> part for the signed </w:t>
+      </w:r>
+      <w:r>
+        <w:rPr>
+          <w:rStyle w:val="HTMLCode"/>
+          <w:color w:val="1A1A1A"/>
+        </w:rPr>
+        <w:t>assetRequestHeaders</w:t>
+      </w:r>
+      <w:r>
+        <w:rPr>
+          <w:rFonts w:ascii="Calibri" w:hAnsi="Calibri" w:cs="Calibri"/>
+          <w:color w:val="1A1A1A"/>
+          <w:sz w:val="22"/>
+          <w:szCs w:val="22"/>
+        </w:rPr>
+        <w:t xml:space="preserve"> the </w:t>
+      </w:r>
+      <w:r>
+        <w:rPr>
+          <w:rFonts w:ascii="Calibri" w:hAnsi="Calibri" w:cs="Calibri"/>
+          <w:color w:val="1A1A1A"/>
+          <w:sz w:val="22"/>
+          <w:szCs w:val="22"/>
+        </w:rPr>
+        <w:t xml:space="preserve">private CDN demands (403 without them, ×3 confirmed), download the bundle and grep it for the Supabase host. Fix: </w:t>
+      </w:r>
+      <w:r>
+        <w:rPr>
+          <w:rStyle w:val="HTMLCode"/>
+          <w:color w:val="1A1A1A"/>
+        </w:rPr>
+        <w:t>eas env:set … --environment preview --environment production</w:t>
+      </w:r>
+      <w:r>
+        <w:rPr>
+          <w:rFonts w:ascii="Calibri" w:hAnsi="Calibri" w:cs="Calibri"/>
+          <w:color w:val="1A1A1A"/>
+          <w:sz w:val="22"/>
+          <w:szCs w:val="22"/>
+        </w:rPr>
+        <w:t xml:space="preserve">, then republish. Remedy in the meantime: </w:t>
+      </w:r>
+      <w:r>
+        <w:rPr>
+          <w:rStyle w:val="HTMLCode"/>
+          <w:color w:val="1A1A1A"/>
+        </w:rPr>
+        <w:t>eas update:rollback &lt;groupId&gt;</w:t>
+      </w:r>
+      <w:r>
+        <w:rPr>
+          <w:rFonts w:ascii="Calibri" w:hAnsi="Calibri" w:cs="Calibri"/>
+          <w:color w:val="1A1A1A"/>
+          <w:sz w:val="22"/>
+          <w:szCs w:val="22"/>
+        </w:rPr>
+        <w:t xml:space="preserve"> (with no prior update it republishes "roll back to the embedded update", so phones keep the bundle inside their APK). The same byte-level check was then run against the </w:t>
+      </w:r>
+      <w:r>
+        <w:rPr>
+          <w:rStyle w:val="Strong"/>
+          <w:rFonts w:ascii="Calibri" w:hAnsi="Calibri" w:cs="Calibri"/>
+          <w:color w:val="1A1A1A"/>
+          <w:sz w:val="22"/>
+          <w:szCs w:val="22"/>
+        </w:rPr>
+        <w:t>APK</w:t>
+      </w:r>
+      <w:r>
+        <w:rPr>
+          <w:rFonts w:ascii="Calibri" w:hAnsi="Calibri" w:cs="Calibri"/>
+          <w:color w:val="1A1A1A"/>
+          <w:sz w:val="22"/>
+          <w:szCs w:val="22"/>
+        </w:rPr>
+        <w:t xml:space="preserve"> itself (unzip </w:t>
+      </w:r>
+      <w:r>
+        <w:rPr>
+          <w:rStyle w:val="HTMLCode"/>
+          <w:color w:val="1A1A1A"/>
+        </w:rPr>
+        <w:t>assets/index.android.bundle</w:t>
+      </w:r>
+      <w:r>
+        <w:rPr>
+          <w:rFonts w:ascii="Calibri" w:hAnsi="Calibri" w:cs="Calibri"/>
+          <w:color w:val="1A1A1A"/>
+          <w:sz w:val="22"/>
+          <w:szCs w:val="22"/>
+        </w:rPr>
+        <w:t xml:space="preserve">, </w:t>
+      </w:r>
+      <w:r>
+        <w:rPr>
+          <w:rFonts w:ascii="Calibri" w:hAnsi="Calibri" w:cs="Calibri"/>
+          <w:color w:val="1A1A1A"/>
+          <w:sz w:val="22"/>
+          <w:szCs w:val="22"/>
+        </w:rPr>
+        <w:t>search for the host) — both paths now verified, and the check is repeatable (</w:t>
+      </w:r>
+      <w:r>
+        <w:rPr>
+          <w:rStyle w:val="HTMLCode"/>
+          <w:color w:val="1A1A1A"/>
+        </w:rPr>
+        <w:t>verify-ota.js</w:t>
+      </w:r>
+      <w:r>
+        <w:rPr>
+          <w:rFonts w:ascii="Calibri" w:hAnsi="Calibri" w:cs="Calibri"/>
+          <w:color w:val="1A1A1A"/>
+          <w:sz w:val="22"/>
+          <w:szCs w:val="22"/>
+        </w:rPr>
+        <w:t xml:space="preserve">, </w:t>
+      </w:r>
+      <w:r>
+        <w:rPr>
+          <w:rStyle w:val="HTMLCode"/>
+          <w:color w:val="1A1A1A"/>
+        </w:rPr>
+        <w:t>verify-apk.ps1</w:t>
+      </w:r>
+      <w:r>
+        <w:rPr>
+          <w:rFonts w:ascii="Calibri" w:hAnsi="Calibri" w:cs="Calibri"/>
+          <w:color w:val="1A1A1A"/>
+          <w:sz w:val="22"/>
+          <w:szCs w:val="22"/>
+        </w:rPr>
+        <w:t xml:space="preserve"> in the working notes).</w:t>
       </w:r>
     </w:p>
     <w:p>
@@ -6316,7 +7096,7 @@
           <w:sz w:val="22"/>
           <w:szCs w:val="22"/>
         </w:rPr>
-        <w:pict w14:anchorId="6E9EB19F">
+        <w:pict w14:anchorId="22508777">
           <v:rect id="_x0000_i1033" style="width:0;height:1.5pt" o:hralign="center" o:hrstd="t" o:hr="t" fillcolor="#a0a0a0" stroked="f"/>
         </w:pict>
       </w:r>
@@ -6347,8 +7127,8 @@
         <w:tblLook w:val="04A0" w:firstRow="1" w:lastRow="0" w:firstColumn="1" w:lastColumn="0" w:noHBand="0" w:noVBand="1"/>
       </w:tblPr>
       <w:tblGrid>
-        <w:gridCol w:w="6300"/>
-        <w:gridCol w:w="3044"/>
+        <w:gridCol w:w="5893"/>
+        <w:gridCol w:w="3451"/>
       </w:tblGrid>
       <w:tr>
         <w:trPr>
@@ -6955,7 +7735,16 @@
                 <w:sz w:val="21"/>
                 <w:szCs w:val="21"/>
               </w:rPr>
-              <w:t xml:space="preserve"> — 71 demo rows</w:t>
+              <w:t xml:space="preserve"> </w:t>
+            </w:r>
+            <w:r>
+              <w:rPr>
+                <w:rFonts w:ascii="Calibri" w:eastAsia="Times New Roman" w:hAnsi="Calibri" w:cs="Calibri"/>
+                <w:color w:val="1A1A1A"/>
+                <w:sz w:val="21"/>
+                <w:szCs w:val="21"/>
+              </w:rPr>
+              <w:t>— 71 demo rows</w:t>
             </w:r>
           </w:p>
         </w:tc>
@@ -7221,30 +8010,23 @@
                 <w:sz w:val="21"/>
                 <w:szCs w:val="21"/>
               </w:rPr>
-              <w:t xml:space="preserve">EAS cloud build </w:t>
+              <w:t>Mobile TypeScript check after the offline/updates/notification work (</w:t>
             </w:r>
             <w:r>
               <w:rPr>
                 <w:rStyle w:val="HTMLCode"/>
                 <w:color w:val="1A1A1A"/>
               </w:rPr>
-              <w:t>faa3abd0</w:t>
-            </w:r>
-            <w:r>
-              <w:rPr>
-                <w:rFonts w:ascii="Calibri" w:eastAsia="Times New Roman" w:hAnsi="Calibri" w:cs="Calibri"/>
-                <w:color w:val="1A1A1A"/>
-                <w:sz w:val="21"/>
-                <w:szCs w:val="21"/>
-              </w:rPr>
-              <w:t xml:space="preserve"> profile </w:t>
-            </w:r>
-            <w:r>
-              <w:rPr>
-                <w:rStyle w:val="HTMLCode"/>
-                <w:color w:val="1A1A1A"/>
-              </w:rPr>
-              <w:t>preview</w:t>
+              <w:t>tsc --noEmit</w:t>
+            </w:r>
+            <w:r>
+              <w:rPr>
+                <w:rFonts w:ascii="Calibri" w:eastAsia="Times New Roman" w:hAnsi="Calibri" w:cs="Calibri"/>
+                <w:color w:val="1A1A1A"/>
+                <w:sz w:val="21"/>
+                <w:szCs w:val="21"/>
+              </w:rPr>
+              <w:t>)</w:t>
             </w:r>
           </w:p>
         </w:tc>
@@ -7291,7 +8073,417 @@
                 <w:sz w:val="21"/>
                 <w:szCs w:val="21"/>
               </w:rPr>
-              <w:t xml:space="preserve"> FINISHED, APK produced</w:t>
+              <w:t xml:space="preserve"> clean</w:t>
+            </w:r>
+          </w:p>
+        </w:tc>
+      </w:tr>
+      <w:tr>
+        <w:tc>
+          <w:tcPr>
+            <w:tcW w:w="0" w:type="auto"/>
+            <w:tcBorders>
+              <w:top w:val="single" w:sz="6" w:space="0" w:color="BBBBBB"/>
+              <w:left w:val="single" w:sz="6" w:space="0" w:color="BBBBBB"/>
+              <w:bottom w:val="single" w:sz="6" w:space="0" w:color="BBBBBB"/>
+              <w:right w:val="single" w:sz="6" w:space="0" w:color="BBBBBB"/>
+            </w:tcBorders>
+            <w:tcMar>
+              <w:top w:w="75" w:type="dxa"/>
+              <w:left w:w="135" w:type="dxa"/>
+              <w:bottom w:w="75" w:type="dxa"/>
+              <w:right w:w="135" w:type="dxa"/>
+            </w:tcMar>
+            <w:hideMark/>
+          </w:tcPr>
+          <w:p>
+            <w:pPr>
+              <w:spacing w:before="150" w:after="150"/>
+              <w:rPr>
+                <w:rFonts w:ascii="Calibri" w:eastAsia="Times New Roman" w:hAnsi="Calibri" w:cs="Calibri"/>
+                <w:color w:val="1A1A1A"/>
+                <w:sz w:val="21"/>
+                <w:szCs w:val="21"/>
+              </w:rPr>
+            </w:pPr>
+            <w:r>
+              <w:rPr>
+                <w:rFonts w:ascii="Calibri" w:eastAsia="Times New Roman" w:hAnsi="Calibri" w:cs="Calibri"/>
+                <w:color w:val="1A1A1A"/>
+                <w:sz w:val="21"/>
+                <w:szCs w:val="21"/>
+              </w:rPr>
+              <w:t xml:space="preserve">EAS cloud build </w:t>
+            </w:r>
+            <w:r>
+              <w:rPr>
+                <w:rStyle w:val="HTMLCode"/>
+                <w:color w:val="1A1A1A"/>
+              </w:rPr>
+              <w:t>a093df69</w:t>
+            </w:r>
+            <w:r>
+              <w:rPr>
+                <w:rFonts w:ascii="Calibri" w:eastAsia="Times New Roman" w:hAnsi="Calibri" w:cs="Calibri"/>
+                <w:color w:val="1A1A1A"/>
+                <w:sz w:val="21"/>
+                <w:szCs w:val="21"/>
+              </w:rPr>
+              <w:t xml:space="preserve"> profile </w:t>
+            </w:r>
+            <w:r>
+              <w:rPr>
+                <w:rStyle w:val="HTMLCode"/>
+                <w:color w:val="1A1A1A"/>
+              </w:rPr>
+              <w:t>preview</w:t>
+            </w:r>
+          </w:p>
+        </w:tc>
+        <w:tc>
+          <w:tcPr>
+            <w:tcW w:w="0" w:type="auto"/>
+            <w:tcBorders>
+              <w:top w:val="single" w:sz="6" w:space="0" w:color="BBBBBB"/>
+              <w:left w:val="single" w:sz="6" w:space="0" w:color="BBBBBB"/>
+              <w:bottom w:val="single" w:sz="6" w:space="0" w:color="BBBBBB"/>
+              <w:right w:val="single" w:sz="6" w:space="0" w:color="BBBBBB"/>
+            </w:tcBorders>
+            <w:tcMar>
+              <w:top w:w="75" w:type="dxa"/>
+              <w:left w:w="135" w:type="dxa"/>
+              <w:bottom w:w="75" w:type="dxa"/>
+              <w:right w:w="135" w:type="dxa"/>
+            </w:tcMar>
+            <w:hideMark/>
+          </w:tcPr>
+          <w:p>
+            <w:pPr>
+              <w:spacing w:before="150" w:after="150"/>
+              <w:rPr>
+                <w:rFonts w:ascii="Calibri" w:eastAsia="Times New Roman" w:hAnsi="Calibri" w:cs="Calibri"/>
+                <w:color w:val="1A1A1A"/>
+                <w:sz w:val="21"/>
+                <w:szCs w:val="21"/>
+              </w:rPr>
+            </w:pPr>
+            <w:r>
+              <w:rPr>
+                <w:rFonts w:ascii="Segoe UI Emoji" w:eastAsia="Times New Roman" w:hAnsi="Segoe UI Emoji" w:cs="Segoe UI Emoji"/>
+                <w:color w:val="1A1A1A"/>
+                <w:sz w:val="21"/>
+                <w:szCs w:val="21"/>
+              </w:rPr>
+              <w:t>✅</w:t>
+            </w:r>
+            <w:r>
+              <w:rPr>
+                <w:rFonts w:ascii="Calibri" w:eastAsia="Times New Roman" w:hAnsi="Calibri" w:cs="Calibri"/>
+                <w:color w:val="1A1A1A"/>
+                <w:sz w:val="21"/>
+                <w:szCs w:val="21"/>
+              </w:rPr>
+              <w:t xml:space="preserve"> FINISHED, versionCode 2, APK produced</w:t>
+            </w:r>
+          </w:p>
+        </w:tc>
+      </w:tr>
+      <w:tr>
+        <w:tc>
+          <w:tcPr>
+            <w:tcW w:w="0" w:type="auto"/>
+            <w:tcBorders>
+              <w:top w:val="single" w:sz="6" w:space="0" w:color="BBBBBB"/>
+              <w:left w:val="single" w:sz="6" w:space="0" w:color="BBBBBB"/>
+              <w:bottom w:val="single" w:sz="6" w:space="0" w:color="BBBBBB"/>
+              <w:right w:val="single" w:sz="6" w:space="0" w:color="BBBBBB"/>
+            </w:tcBorders>
+            <w:tcMar>
+              <w:top w:w="75" w:type="dxa"/>
+              <w:left w:w="135" w:type="dxa"/>
+              <w:bottom w:w="75" w:type="dxa"/>
+              <w:right w:w="135" w:type="dxa"/>
+            </w:tcMar>
+            <w:hideMark/>
+          </w:tcPr>
+          <w:p>
+            <w:pPr>
+              <w:spacing w:before="150" w:after="150"/>
+              <w:rPr>
+                <w:rFonts w:ascii="Calibri" w:eastAsia="Times New Roman" w:hAnsi="Calibri" w:cs="Calibri"/>
+                <w:color w:val="1A1A1A"/>
+                <w:sz w:val="21"/>
+                <w:szCs w:val="21"/>
+              </w:rPr>
+            </w:pPr>
+            <w:r>
+              <w:rPr>
+                <w:rFonts w:ascii="Calibri" w:eastAsia="Times New Roman" w:hAnsi="Calibri" w:cs="Calibri"/>
+                <w:color w:val="1A1A1A"/>
+                <w:sz w:val="21"/>
+                <w:szCs w:val="21"/>
+              </w:rPr>
+              <w:t xml:space="preserve">Published APK contains the Supabase config (byte search of </w:t>
+            </w:r>
+            <w:r>
+              <w:rPr>
+                <w:rStyle w:val="HTMLCode"/>
+                <w:color w:val="1A1A1A"/>
+              </w:rPr>
+              <w:t>assets/index.android.bundle</w:t>
+            </w:r>
+            <w:r>
+              <w:rPr>
+                <w:rFonts w:ascii="Calibri" w:eastAsia="Times New Roman" w:hAnsi="Calibri" w:cs="Calibri"/>
+                <w:color w:val="1A1A1A"/>
+                <w:sz w:val="21"/>
+                <w:szCs w:val="21"/>
+              </w:rPr>
+              <w:t>)</w:t>
+            </w:r>
+          </w:p>
+        </w:tc>
+        <w:tc>
+          <w:tcPr>
+            <w:tcW w:w="0" w:type="auto"/>
+            <w:tcBorders>
+              <w:top w:val="single" w:sz="6" w:space="0" w:color="BBBBBB"/>
+              <w:left w:val="single" w:sz="6" w:space="0" w:color="BBBBBB"/>
+              <w:bottom w:val="single" w:sz="6" w:space="0" w:color="BBBBBB"/>
+              <w:right w:val="single" w:sz="6" w:space="0" w:color="BBBBBB"/>
+            </w:tcBorders>
+            <w:tcMar>
+              <w:top w:w="75" w:type="dxa"/>
+              <w:left w:w="135" w:type="dxa"/>
+              <w:bottom w:w="75" w:type="dxa"/>
+              <w:right w:w="135" w:type="dxa"/>
+            </w:tcMar>
+            <w:hideMark/>
+          </w:tcPr>
+          <w:p>
+            <w:pPr>
+              <w:spacing w:before="150" w:after="150"/>
+              <w:rPr>
+                <w:rFonts w:ascii="Calibri" w:eastAsia="Times New Roman" w:hAnsi="Calibri" w:cs="Calibri"/>
+                <w:color w:val="1A1A1A"/>
+                <w:sz w:val="21"/>
+                <w:szCs w:val="21"/>
+              </w:rPr>
+            </w:pPr>
+            <w:r>
+              <w:rPr>
+                <w:rFonts w:ascii="Segoe UI Emoji" w:eastAsia="Times New Roman" w:hAnsi="Segoe UI Emoji" w:cs="Segoe UI Emoji"/>
+                <w:color w:val="1A1A1A"/>
+                <w:sz w:val="21"/>
+                <w:szCs w:val="21"/>
+              </w:rPr>
+              <w:t>✅</w:t>
+            </w:r>
+            <w:r>
+              <w:rPr>
+                <w:rFonts w:ascii="Calibri" w:eastAsia="Times New Roman" w:hAnsi="Calibri" w:cs="Calibri"/>
+                <w:color w:val="1A1A1A"/>
+                <w:sz w:val="21"/>
+                <w:szCs w:val="21"/>
+              </w:rPr>
+              <w:t xml:space="preserve"> host + key present</w:t>
+            </w:r>
+          </w:p>
+        </w:tc>
+      </w:tr>
+      <w:tr>
+        <w:tc>
+          <w:tcPr>
+            <w:tcW w:w="0" w:type="auto"/>
+            <w:tcBorders>
+              <w:top w:val="single" w:sz="6" w:space="0" w:color="BBBBBB"/>
+              <w:left w:val="single" w:sz="6" w:space="0" w:color="BBBBBB"/>
+              <w:bottom w:val="single" w:sz="6" w:space="0" w:color="BBBBBB"/>
+              <w:right w:val="single" w:sz="6" w:space="0" w:color="BBBBBB"/>
+            </w:tcBorders>
+            <w:tcMar>
+              <w:top w:w="75" w:type="dxa"/>
+              <w:left w:w="135" w:type="dxa"/>
+              <w:bottom w:w="75" w:type="dxa"/>
+              <w:right w:w="135" w:type="dxa"/>
+            </w:tcMar>
+            <w:hideMark/>
+          </w:tcPr>
+          <w:p>
+            <w:pPr>
+              <w:spacing w:before="150" w:after="150"/>
+              <w:rPr>
+                <w:rFonts w:ascii="Calibri" w:eastAsia="Times New Roman" w:hAnsi="Calibri" w:cs="Calibri"/>
+                <w:color w:val="1A1A1A"/>
+                <w:sz w:val="21"/>
+                <w:szCs w:val="21"/>
+              </w:rPr>
+            </w:pPr>
+            <w:r>
+              <w:rPr>
+                <w:rFonts w:ascii="Calibri" w:eastAsia="Times New Roman" w:hAnsi="Calibri" w:cs="Calibri"/>
+                <w:color w:val="1A1A1A"/>
+                <w:sz w:val="21"/>
+                <w:szCs w:val="21"/>
+              </w:rPr>
+              <w:t xml:space="preserve">Over-the-air update published to channel </w:t>
+            </w:r>
+            <w:r>
+              <w:rPr>
+                <w:rStyle w:val="HTMLCode"/>
+                <w:color w:val="1A1A1A"/>
+              </w:rPr>
+              <w:t>preview</w:t>
+            </w:r>
+            <w:r>
+              <w:rPr>
+                <w:rFonts w:ascii="Calibri" w:eastAsia="Times New Roman" w:hAnsi="Calibri" w:cs="Calibri"/>
+                <w:color w:val="1A1A1A"/>
+                <w:sz w:val="21"/>
+                <w:szCs w:val="21"/>
+              </w:rPr>
+              <w:t xml:space="preserve">, runtime </w:t>
+            </w:r>
+            <w:r>
+              <w:rPr>
+                <w:rStyle w:val="HTMLCode"/>
+                <w:color w:val="1A1A1A"/>
+              </w:rPr>
+              <w:t>2.0.0</w:t>
+            </w:r>
+          </w:p>
+        </w:tc>
+        <w:tc>
+          <w:tcPr>
+            <w:tcW w:w="0" w:type="auto"/>
+            <w:tcBorders>
+              <w:top w:val="single" w:sz="6" w:space="0" w:color="BBBBBB"/>
+              <w:left w:val="single" w:sz="6" w:space="0" w:color="BBBBBB"/>
+              <w:bottom w:val="single" w:sz="6" w:space="0" w:color="BBBBBB"/>
+              <w:right w:val="single" w:sz="6" w:space="0" w:color="BBBBBB"/>
+            </w:tcBorders>
+            <w:tcMar>
+              <w:top w:w="75" w:type="dxa"/>
+              <w:left w:w="135" w:type="dxa"/>
+              <w:bottom w:w="75" w:type="dxa"/>
+              <w:right w:w="135" w:type="dxa"/>
+            </w:tcMar>
+            <w:hideMark/>
+          </w:tcPr>
+          <w:p>
+            <w:pPr>
+              <w:spacing w:before="150" w:after="150"/>
+              <w:rPr>
+                <w:rFonts w:ascii="Calibri" w:eastAsia="Times New Roman" w:hAnsi="Calibri" w:cs="Calibri"/>
+                <w:color w:val="1A1A1A"/>
+                <w:sz w:val="21"/>
+                <w:szCs w:val="21"/>
+              </w:rPr>
+            </w:pPr>
+            <w:r>
+              <w:rPr>
+                <w:rFonts w:ascii="Segoe UI Emoji" w:eastAsia="Times New Roman" w:hAnsi="Segoe UI Emoji" w:cs="Segoe UI Emoji"/>
+                <w:color w:val="1A1A1A"/>
+                <w:sz w:val="21"/>
+                <w:szCs w:val="21"/>
+              </w:rPr>
+              <w:t>✅</w:t>
+            </w:r>
+            <w:r>
+              <w:rPr>
+                <w:rFonts w:ascii="Calibri" w:eastAsia="Times New Roman" w:hAnsi="Calibri" w:cs="Calibri"/>
+                <w:color w:val="1A1A1A"/>
+                <w:sz w:val="21"/>
+                <w:szCs w:val="21"/>
+              </w:rPr>
+              <w:t xml:space="preserve"> manifest served, bundle contains the Supabase config</w:t>
+            </w:r>
+          </w:p>
+        </w:tc>
+      </w:tr>
+      <w:tr>
+        <w:tc>
+          <w:tcPr>
+            <w:tcW w:w="0" w:type="auto"/>
+            <w:tcBorders>
+              <w:top w:val="single" w:sz="6" w:space="0" w:color="BBBBBB"/>
+              <w:left w:val="single" w:sz="6" w:space="0" w:color="BBBBBB"/>
+              <w:bottom w:val="single" w:sz="6" w:space="0" w:color="BBBBBB"/>
+              <w:right w:val="single" w:sz="6" w:space="0" w:color="BBBBBB"/>
+            </w:tcBorders>
+            <w:tcMar>
+              <w:top w:w="75" w:type="dxa"/>
+              <w:left w:w="135" w:type="dxa"/>
+              <w:bottom w:w="75" w:type="dxa"/>
+              <w:right w:w="135" w:type="dxa"/>
+            </w:tcMar>
+            <w:hideMark/>
+          </w:tcPr>
+          <w:p>
+            <w:pPr>
+              <w:spacing w:before="150" w:after="150"/>
+              <w:rPr>
+                <w:rFonts w:ascii="Calibri" w:eastAsia="Times New Roman" w:hAnsi="Calibri" w:cs="Calibri"/>
+                <w:color w:val="1A1A1A"/>
+                <w:sz w:val="21"/>
+                <w:szCs w:val="21"/>
+              </w:rPr>
+            </w:pPr>
+            <w:r>
+              <w:rPr>
+                <w:rFonts w:ascii="Calibri" w:eastAsia="Times New Roman" w:hAnsi="Calibri" w:cs="Calibri"/>
+                <w:color w:val="1A1A1A"/>
+                <w:sz w:val="21"/>
+                <w:szCs w:val="21"/>
+              </w:rPr>
+              <w:t>First OTA attempt without EAS environment variables</w:t>
+            </w:r>
+          </w:p>
+        </w:tc>
+        <w:tc>
+          <w:tcPr>
+            <w:tcW w:w="0" w:type="auto"/>
+            <w:tcBorders>
+              <w:top w:val="single" w:sz="6" w:space="0" w:color="BBBBBB"/>
+              <w:left w:val="single" w:sz="6" w:space="0" w:color="BBBBBB"/>
+              <w:bottom w:val="single" w:sz="6" w:space="0" w:color="BBBBBB"/>
+              <w:right w:val="single" w:sz="6" w:space="0" w:color="BBBBBB"/>
+            </w:tcBorders>
+            <w:tcMar>
+              <w:top w:w="75" w:type="dxa"/>
+              <w:left w:w="135" w:type="dxa"/>
+              <w:bottom w:w="75" w:type="dxa"/>
+              <w:right w:w="135" w:type="dxa"/>
+            </w:tcMar>
+            <w:hideMark/>
+          </w:tcPr>
+          <w:p>
+            <w:pPr>
+              <w:spacing w:before="150" w:after="150"/>
+              <w:rPr>
+                <w:rFonts w:ascii="Calibri" w:eastAsia="Times New Roman" w:hAnsi="Calibri" w:cs="Calibri"/>
+                <w:color w:val="1A1A1A"/>
+                <w:sz w:val="21"/>
+                <w:szCs w:val="21"/>
+              </w:rPr>
+            </w:pPr>
+            <w:r>
+              <w:rPr>
+                <w:rFonts w:ascii="Segoe UI Emoji" w:eastAsia="Times New Roman" w:hAnsi="Segoe UI Emoji" w:cs="Segoe UI Emoji"/>
+                <w:color w:val="1A1A1A"/>
+                <w:sz w:val="21"/>
+                <w:szCs w:val="21"/>
+              </w:rPr>
+              <w:t>❌</w:t>
+            </w:r>
+            <w:r>
+              <w:rPr>
+                <w:rFonts w:ascii="Calibri" w:eastAsia="Times New Roman" w:hAnsi="Calibri" w:cs="Calibri"/>
+                <w:color w:val="1A1A1A"/>
+                <w:sz w:val="21"/>
+                <w:szCs w:val="21"/>
+              </w:rPr>
+              <w:t xml:space="preserve"> caught and rolled back before any phone could apply it</w:t>
             </w:r>
           </w:p>
         </w:tc>
@@ -7324,16 +8516,7 @@
           <w:sz w:val="22"/>
           <w:szCs w:val="22"/>
         </w:rPr>
-        <w:t xml:space="preserve"> worker signs in on the APK → captures a </w:t>
-      </w:r>
-      <w:r>
-        <w:rPr>
-          <w:rFonts w:ascii="Calibri" w:hAnsi="Calibri" w:cs="Calibri"/>
-          <w:color w:val="1A1A1A"/>
-          <w:sz w:val="22"/>
-          <w:szCs w:val="22"/>
-        </w:rPr>
-        <w:t>record offline (airplane mode) → reconnects → auto-upload → admin approves on the web → worker receives notification → admin exports hazard PDF.</w:t>
+        <w:t xml:space="preserve"> worker signs in on the APK → captures a record offline (airplane mode) → reconnects → auto-upload → admin approves on the web → worker receives notification → admin exports hazard PDF.</w:t>
       </w:r>
     </w:p>
     <w:p>
@@ -7353,7 +8536,7 @@
           <w:sz w:val="22"/>
           <w:szCs w:val="22"/>
         </w:rPr>
-        <w:pict w14:anchorId="591103D1">
+        <w:pict w14:anchorId="06699DC0">
           <v:rect id="_x0000_i1034" style="width:0;height:1.5pt" o:hralign="center" o:hrstd="t" o:hr="t" fillcolor="#a0a0a0" stroked="f"/>
         </w:pict>
       </w:r>
@@ -7530,7 +8713,25 @@
           <w:sz w:val="22"/>
           <w:szCs w:val="22"/>
         </w:rPr>
-        <w:t xml:space="preserve"> are in-app inbox only (no APNs/FCM push delivery).</w:t>
+        <w:t xml:space="preserve"> are not true background push: the app announces a review within about 20 seconds </w:t>
+      </w:r>
+      <w:r>
+        <w:rPr>
+          <w:rStyle w:val="Emphasis"/>
+          <w:rFonts w:ascii="Calibri" w:eastAsia="Times New Roman" w:hAnsi="Calibri" w:cs="Calibri"/>
+          <w:sz w:val="22"/>
+          <w:szCs w:val="22"/>
+        </w:rPr>
+        <w:t>while it is running</w:t>
+      </w:r>
+      <w:r>
+        <w:rPr>
+          <w:rFonts w:ascii="Calibri" w:eastAsia="Times New Roman" w:hAnsi="Calibri" w:cs="Calibri"/>
+          <w:color w:val="1A1A1A"/>
+          <w:sz w:val="22"/>
+          <w:szCs w:val="22"/>
+        </w:rPr>
+        <w:t>, and anything that happened while the app was closed appears on the next launch. Real background delivery needs a Firebase project, an Expo push token and a server-side sender (see future work).</w:t>
       </w:r>
     </w:p>
     <w:p>
@@ -7590,7 +8791,7 @@
           <w:sz w:val="22"/>
           <w:szCs w:val="22"/>
         </w:rPr>
-        <w:pict w14:anchorId="7CCC47DB">
+        <w:pict w14:anchorId="1CD58719">
           <v:rect id="_x0000_i1035" style="width:0;height:1.5pt" o:hralign="center" o:hrstd="t" o:hr="t" fillcolor="#a0a0a0" stroked="f"/>
         </w:pict>
       </w:r>
@@ -7630,7 +8831,7 @@
           <w:sz w:val="22"/>
           <w:szCs w:val="22"/>
         </w:rPr>
-        <w:t>Real push notifications to field phones (expo-notifications + FCM).</w:t>
+        <w:t>Real background push notifications (Firebase project + Expo push token + a server-side sender such as a Supabase Edge Function on the review trigger).</w:t>
       </w:r>
     </w:p>
     <w:p>
@@ -7806,7 +9007,16 @@
           <w:sz w:val="22"/>
           <w:szCs w:val="22"/>
         </w:rPr>
-        <w:t xml:space="preserve">; the only requirement is the paid Apple Developer Program (US$99/yr). The full runbook is in </w:t>
+        <w:t xml:space="preserve">; the only requirement is the paid </w:t>
+      </w:r>
+      <w:r>
+        <w:rPr>
+          <w:rFonts w:ascii="Calibri" w:eastAsia="Times New Roman" w:hAnsi="Calibri" w:cs="Calibri"/>
+          <w:color w:val="1A1A1A"/>
+          <w:sz w:val="22"/>
+          <w:szCs w:val="22"/>
+        </w:rPr>
+        <w:t xml:space="preserve">Apple Developer Program (US$99/yr). The full runbook is in </w:t>
       </w:r>
       <w:r>
         <w:rPr>
@@ -7842,7 +9052,7 @@
           <w:sz w:val="22"/>
           <w:szCs w:val="22"/>
         </w:rPr>
-        <w:pict w14:anchorId="43EDA215">
+        <w:pict w14:anchorId="46AC9456">
           <v:rect id="_x0000_i1036" style="width:0;height:1.5pt" o:hralign="center" o:hrstd="t" o:hr="t" fillcolor="#a0a0a0" stroked="f"/>
         </w:pict>
       </w:r>
@@ -8034,12 +9244,9 @@
           <w:szCs w:val="19"/>
           <w:shd w:val="clear" w:color="auto" w:fill="F0F4F1"/>
         </w:rPr>
-        <w:t>│       ├── context/           AuthContext (session)</w:t>
-      </w:r>
-    </w:p>
-    <w:p>
-      <w:pPr>
-        <w:pStyle w:val="HTMLPreformatted"/>
+        <w:t xml:space="preserve">│    </w:t>
+      </w:r>
+      <w:r>
         <w:rPr>
           <w:rFonts w:ascii="Consolas" w:hAnsi="Consolas"/>
           <w:color w:val="1A1A1A"/>
@@ -8047,8 +9254,12 @@
           <w:szCs w:val="19"/>
           <w:shd w:val="clear" w:color="auto" w:fill="F0F4F1"/>
         </w:rPr>
-      </w:pPr>
-      <w:r>
+        <w:t xml:space="preserve">   ├── lib/               api · sqlite (drafts/outbox) · sync · network ·</w:t>
+      </w:r>
+    </w:p>
+    <w:p>
+      <w:pPr>
+        <w:pStyle w:val="HTMLPreformatted"/>
         <w:rPr>
           <w:rFonts w:ascii="Consolas" w:hAnsi="Consolas"/>
           <w:color w:val="1A1A1A"/>
@@ -8056,8 +9267,7 @@
           <w:szCs w:val="19"/>
           <w:shd w:val="clear" w:color="auto" w:fill="F0F4F1"/>
         </w:rPr>
-        <w:t xml:space="preserve">│       </w:t>
-      </w:r>
+      </w:pPr>
       <w:r>
         <w:rPr>
           <w:rFonts w:ascii="Consolas" w:hAnsi="Consolas"/>
@@ -8066,7 +9276,7 @@
           <w:szCs w:val="19"/>
           <w:shd w:val="clear" w:color="auto" w:fill="F0F4F1"/>
         </w:rPr>
-        <w:t>└── navigation/        RootNavigator</w:t>
+        <w:t>│       │                      notifications (watcher) · updates (OTA)</w:t>
       </w:r>
     </w:p>
     <w:p>
@@ -8088,7 +9298,7 @@
           <w:szCs w:val="19"/>
           <w:shd w:val="clear" w:color="auto" w:fill="F0F4F1"/>
         </w:rPr>
-        <w:t>├── web/                       Next.js admin dashboard (deployed to Vercel)</w:t>
+        <w:t>│       ├── context/           AuthContext (session + cached profile)</w:t>
       </w:r>
     </w:p>
     <w:p>
@@ -8110,7 +9320,7 @@
           <w:szCs w:val="19"/>
           <w:shd w:val="clear" w:color="auto" w:fill="F0F4F1"/>
         </w:rPr>
-        <w:t>│   └── src/app/</w:t>
+        <w:t>│       └── navigation/        RootNavigator</w:t>
       </w:r>
     </w:p>
     <w:p>
@@ -8132,7 +9342,7 @@
           <w:szCs w:val="19"/>
           <w:shd w:val="clear" w:color="auto" w:fill="F0F4F1"/>
         </w:rPr>
-        <w:t>│       ├── (app)/dashboard/   stats + charts</w:t>
+        <w:t>├── web/                       Next.js admin dashboard (deployed to Vercel)</w:t>
       </w:r>
     </w:p>
     <w:p>
@@ -8154,7 +9364,7 @@
           <w:szCs w:val="19"/>
           <w:shd w:val="clear" w:color="auto" w:fill="F0F4F1"/>
         </w:rPr>
-        <w:t>│       ├── (app)/records/     list + [id] detail/review</w:t>
+        <w:t>│   └── src/app/</w:t>
       </w:r>
     </w:p>
     <w:p>
@@ -8176,7 +9386,7 @@
           <w:szCs w:val="19"/>
           <w:shd w:val="clear" w:color="auto" w:fill="F0F4F1"/>
         </w:rPr>
-        <w:t>│       ├── (app)/map/         Leaflet map</w:t>
+        <w:t>│       ├── (app)/dashboard/   stats + charts</w:t>
       </w:r>
     </w:p>
     <w:p>
@@ -8198,7 +9408,7 @@
           <w:szCs w:val="19"/>
           <w:shd w:val="clear" w:color="auto" w:fill="F0F4F1"/>
         </w:rPr>
-        <w:t>│       ├── (app)/zones/       zone management</w:t>
+        <w:t>│       ├── (app)/records/     list + [id] detail/review</w:t>
       </w:r>
     </w:p>
     <w:p>
@@ -8220,7 +9430,7 @@
           <w:szCs w:val="19"/>
           <w:shd w:val="clear" w:color="auto" w:fill="F0F4F1"/>
         </w:rPr>
-        <w:t>│       ├── (app)/users/       user management</w:t>
+        <w:t>│       ├── (app)/map/         Leaflet map</w:t>
       </w:r>
     </w:p>
     <w:p>
@@ -8242,12 +9452,9 @@
           <w:szCs w:val="19"/>
           <w:shd w:val="clear" w:color="auto" w:fill="F0F4F1"/>
         </w:rPr>
-        <w:t>│       └── api/export/     →  hazard PDF export (pdfkit)</w:t>
-      </w:r>
-    </w:p>
-    <w:p>
-      <w:pPr>
-        <w:pStyle w:val="HTMLPreformatted"/>
+        <w:t xml:space="preserve">│       </w:t>
+      </w:r>
+      <w:r>
         <w:rPr>
           <w:rFonts w:ascii="Consolas" w:hAnsi="Consolas"/>
           <w:color w:val="1A1A1A"/>
@@ -8255,8 +9462,12 @@
           <w:szCs w:val="19"/>
           <w:shd w:val="clear" w:color="auto" w:fill="F0F4F1"/>
         </w:rPr>
-      </w:pPr>
-      <w:r>
+        <w:t>├── (app)/zones/       zone management</w:t>
+      </w:r>
+    </w:p>
+    <w:p>
+      <w:pPr>
+        <w:pStyle w:val="HTMLPreformatted"/>
         <w:rPr>
           <w:rFonts w:ascii="Consolas" w:hAnsi="Consolas"/>
           <w:color w:val="1A1A1A"/>
@@ -8264,12 +9475,8 @@
           <w:szCs w:val="19"/>
           <w:shd w:val="clear" w:color="auto" w:fill="F0F4F1"/>
         </w:rPr>
-        <w:t>├── supabase/                  01_schema … 09_delete_own_pending, 07_demo_data,</w:t>
-      </w:r>
-    </w:p>
-    <w:p>
-      <w:pPr>
-        <w:pStyle w:val="HTMLPreformatted"/>
+      </w:pPr>
+      <w:r>
         <w:rPr>
           <w:rFonts w:ascii="Consolas" w:hAnsi="Consolas"/>
           <w:color w:val="1A1A1A"/>
@@ -8277,8 +9484,12 @@
           <w:szCs w:val="19"/>
           <w:shd w:val="clear" w:color="auto" w:fill="F0F4F1"/>
         </w:rPr>
-      </w:pPr>
-      <w:r>
+        <w:t>│       ├── (app)/users/       user management</w:t>
+      </w:r>
+    </w:p>
+    <w:p>
+      <w:pPr>
+        <w:pStyle w:val="HTMLPreformatted"/>
         <w:rPr>
           <w:rFonts w:ascii="Consolas" w:hAnsi="Consolas"/>
           <w:color w:val="1A1A1A"/>
@@ -8286,8 +9497,7 @@
           <w:szCs w:val="19"/>
           <w:shd w:val="clear" w:color="auto" w:fill="F0F4F1"/>
         </w:rPr>
-        <w:t xml:space="preserve">│   </w:t>
-      </w:r>
+      </w:pPr>
       <w:r>
         <w:rPr>
           <w:rFonts w:ascii="Consolas" w:hAnsi="Consolas"/>
@@ -8296,7 +9506,7 @@
           <w:szCs w:val="19"/>
           <w:shd w:val="clear" w:color="auto" w:fill="F0F4F1"/>
         </w:rPr>
-        <w:t xml:space="preserve">                           08_backfill_profiles, generated setup_all.sql (gitignored)</w:t>
+        <w:t>│       └── api/export/     →  hazard PDF export (pdfkit)</w:t>
       </w:r>
     </w:p>
     <w:p>
@@ -8318,7 +9528,7 @@
           <w:szCs w:val="19"/>
           <w:shd w:val="clear" w:color="auto" w:fill="F0F4F1"/>
         </w:rPr>
-        <w:t>├── tools/                     make-app-icons.ps1 · bundle-db-sql.ps1 · onedrive-links.ps1</w:t>
+        <w:t>├── supabase/                  01_schema … 09_delete_own_pending, 07_demo_data,</w:t>
       </w:r>
     </w:p>
     <w:p>
@@ -8340,7 +9550,7 @@
           <w:szCs w:val="19"/>
           <w:shd w:val="clear" w:color="auto" w:fill="F0F4F1"/>
         </w:rPr>
-        <w:t>└── docs/                      README · ARCHITECTURE · DATABASE · WORKFLOWS</w:t>
+        <w:t>│                              08_backfill_profiles, generated setup_all.sql (gitignored)</w:t>
       </w:r>
     </w:p>
     <w:p>
@@ -8362,7 +9572,61 @@
           <w:szCs w:val="19"/>
           <w:shd w:val="clear" w:color="auto" w:fill="F0F4F1"/>
         </w:rPr>
-        <w:t xml:space="preserve">                               · SETUP · DEPLOY · PROJECT_REPORT (this file)</w:t>
+        <w:t>├── tools/                     make-app-icons.ps1 · bundle-db-sql.ps1 · onedrive-links.ps1</w:t>
+      </w:r>
+    </w:p>
+    <w:p>
+      <w:pPr>
+        <w:pStyle w:val="HTMLPreformatted"/>
+        <w:rPr>
+          <w:rFonts w:ascii="Consolas" w:hAnsi="Consolas"/>
+          <w:color w:val="1A1A1A"/>
+          <w:sz w:val="19"/>
+          <w:szCs w:val="19"/>
+          <w:shd w:val="clear" w:color="auto" w:fill="F0F4F1"/>
+        </w:rPr>
+      </w:pPr>
+      <w:r>
+        <w:rPr>
+          <w:rFonts w:ascii="Consolas" w:hAnsi="Consolas"/>
+          <w:color w:val="1A1A1A"/>
+          <w:sz w:val="19"/>
+          <w:szCs w:val="19"/>
+          <w:shd w:val="clear" w:color="auto" w:fill="F0F4F1"/>
+        </w:rPr>
+        <w:t>└── docs/                      README · ARCHITECTURE · DATABASE · WORKFLOWS</w:t>
+      </w:r>
+    </w:p>
+    <w:p>
+      <w:pPr>
+        <w:pStyle w:val="HTMLPreformatted"/>
+        <w:rPr>
+          <w:rFonts w:ascii="Consolas" w:hAnsi="Consolas"/>
+          <w:color w:val="1A1A1A"/>
+          <w:sz w:val="19"/>
+          <w:szCs w:val="19"/>
+          <w:shd w:val="clear" w:color="auto" w:fill="F0F4F1"/>
+        </w:rPr>
+      </w:pPr>
+      <w:r>
+        <w:rPr>
+          <w:rFonts w:ascii="Consolas" w:hAnsi="Consolas"/>
+          <w:color w:val="1A1A1A"/>
+          <w:sz w:val="19"/>
+          <w:szCs w:val="19"/>
+          <w:shd w:val="clear" w:color="auto" w:fill="F0F4F1"/>
+        </w:rPr>
+        <w:t xml:space="preserve">                               </w:t>
+      </w:r>
+      <w:r>
+        <w:rPr>
+          <w:rFonts w:ascii="Consolas" w:hAnsi="Consolas"/>
+          <w:color w:val="1A1A1A"/>
+          <w:sz w:val="19"/>
+          <w:szCs w:val="19"/>
+          <w:shd w:val="clear" w:color="auto" w:fill="F0F4F1"/>
+        </w:rPr>
+        <w:t>· SETUP · DEPLOY · PROJECT_REPORT (this file)</w:t>
       </w:r>
     </w:p>
     <w:p>
@@ -9037,7 +10301,7 @@
           <w:sz w:val="22"/>
           <w:szCs w:val="22"/>
         </w:rPr>
-        <w:pict w14:anchorId="0E6FCD7C">
+        <w:pict w14:anchorId="65C3814E">
           <v:rect id="_x0000_i1037" style="width:0;height:1.5pt" o:hralign="center" o:hrstd="t" o:hr="t" fillcolor="#a0a0a0" stroked="f"/>
         </w:pict>
       </w:r>
@@ -9059,7 +10323,7 @@
           <w:sz w:val="22"/>
           <w:szCs w:val="22"/>
         </w:rPr>
-        <w:t xml:space="preserve">Prepared by the Millennia FieldOps project — everything above reflects the verified state of the live system as of 17 October 2026 (21 commits, HEAD </w:t>
+        <w:t xml:space="preserve">Prepared by the Millennia FieldOps project — everything above reflects the verified state of the live system as of 17 October 2026 (working tree clean, everything pushed; mobile work in commit </w:t>
       </w:r>
       <w:r>
         <w:rPr>
@@ -9068,7 +10332,7 @@
           <w:iCs/>
           <w:color w:val="555555"/>
         </w:rPr>
-        <w:t>cfeb302</w:t>
+        <w:t>de0ddea</w:t>
       </w:r>
       <w:r>
         <w:rPr>
@@ -9077,7 +10341,7 @@
           <w:sz w:val="22"/>
           <w:szCs w:val="22"/>
         </w:rPr>
-        <w:t>, working tree clean).</w:t>
+        <w:t>, documentation in the commits that follow it).</w:t>
       </w:r>
     </w:p>
     <w:sectPr>
@@ -9093,9 +10357,9 @@
 <file path=word/numbering.xml><?xml version="1.0" encoding="utf-8"?>
 <w:numbering xmlns:wpc="http://schemas.microsoft.com/office/word/2010/wordprocessingCanvas" xmlns:cx="http://schemas.microsoft.com/office/drawing/2014/chartex" xmlns:cx1="http://schemas.microsoft.com/office/drawing/2015/9/8/chartex" xmlns:cx2="http://schemas.microsoft.com/office/drawing/2015/10/21/chartex" xmlns:cx3="http://schemas.microsoft.com/office/drawing/2016/5/9/chartex" xmlns:cx4="http://schemas.microsoft.com/office/drawing/2016/5/10/chartex" xmlns:cx5="http://schemas.microsoft.com/office/drawing/2016/5/11/chartex" xmlns:cx6="http://schemas.microsoft.com/office/drawing/2016/5/12/chartex" xmlns:cx7="http://schemas.microsoft.com/office/drawing/2016/5/13/chartex" xmlns:cx8="http://schemas.microsoft.com/office/drawing/2016/5/14/chartex" xmlns:mc="http://schemas.openxmlformats.org/markup-compatibility/2006" xmlns:aink="http://schemas.microsoft.com/office/drawing/2016/ink" xmlns:am3d="http://schemas.microsoft.com/office/drawing/2017/model3d" xmlns:o="urn:schemas-microsoft-com:office:office" xmlns:oel="http://schemas.microsoft.com/office/2019/extlst" xmlns:r="http://schemas.openxmlformats.org/officeDocument/2006/relationships" xmlns:m="http://schemas.openxmlformats.org/officeDocument/2006/math" xmlns:v="urn:schemas-microsoft-com:vml" xmlns:wp14="http://schemas.microsoft.com/office/word/2010/wordprocessingDrawing" xmlns:wp="http://schemas.openxmlformats.org/drawingml/2006/wordprocessingDrawing" xmlns:w10="urn:schemas-microsoft-com:office:word" xmlns:w="http://schemas.openxmlformats.org/wordprocessingml/2006/main" xmlns:w14="http://schemas.microsoft.com/office/word/2010/wordml" xmlns:w15="http://schemas.microsoft.com/office/word/2012/wordml" xmlns:w16cex="http://schemas.microsoft.com/office/word/2018/wordml/cex" xmlns:w16cid="http://schemas.microsoft.com/office/word/2016/wordml/cid" xmlns:w16="http://schemas.microsoft.com/office/word/2018/wordml" xmlns:w16du="http://schemas.microsoft.com/office/word/2023/wordml/word16du" xmlns:w16sdtdh="http://schemas.microsoft.com/office/word/2020/wordml/sdtdatahash" xmlns:w16sdtfl="http://schemas.microsoft.com/office/word/2024/wordml/sdtformatlock" xmlns:w16se="http://schemas.microsoft.com/office/word/2015/wordml/symex" xmlns:wpg="http://schemas.microsoft.com/office/word/2010/wordprocessingGroup" xmlns:wpi="http://schemas.microsoft.com/office/word/2010/wordprocessingInk" xmlns:wne="http://schemas.microsoft.com/office/word/2006/wordml" xmlns:wps="http://schemas.microsoft.com/office/word/2010/wordprocessingShape" mc:Ignorable="w14 w15 w16se w16cid w16 w16cex w16sdtdh w16sdtfl w16du wp14">
   <w:abstractNum w:abstractNumId="0" w15:restartNumberingAfterBreak="0">
-    <w:nsid w:val="0D442B85"/>
+    <w:nsid w:val="1FCE4DDF"/>
     <w:multiLevelType w:val="multilevel"/>
-    <w:tmpl w:val="A3BE56BE"/>
+    <w:tmpl w:val="65A8334C"/>
     <w:lvl w:ilvl="0">
       <w:start w:val="1"/>
       <w:numFmt w:val="bullet"/>
@@ -9242,9 +10506,9 @@
     </w:lvl>
   </w:abstractNum>
   <w:abstractNum w:abstractNumId="1" w15:restartNumberingAfterBreak="0">
-    <w:nsid w:val="0EA1641E"/>
+    <w:nsid w:val="216719B7"/>
     <w:multiLevelType w:val="multilevel"/>
-    <w:tmpl w:val="2A30DADC"/>
+    <w:tmpl w:val="62E2D83C"/>
     <w:lvl w:ilvl="0">
       <w:start w:val="1"/>
       <w:numFmt w:val="bullet"/>
@@ -9391,9 +10655,9 @@
     </w:lvl>
   </w:abstractNum>
   <w:abstractNum w:abstractNumId="2" w15:restartNumberingAfterBreak="0">
-    <w:nsid w:val="1FCC7FB7"/>
+    <w:nsid w:val="32EC4B4A"/>
     <w:multiLevelType w:val="multilevel"/>
-    <w:tmpl w:val="B60EE666"/>
+    <w:tmpl w:val="2500E130"/>
     <w:lvl w:ilvl="0">
       <w:start w:val="1"/>
       <w:numFmt w:val="decimal"/>
@@ -9504,9 +10768,9 @@
     </w:lvl>
   </w:abstractNum>
   <w:abstractNum w:abstractNumId="3" w15:restartNumberingAfterBreak="0">
-    <w:nsid w:val="2ABB7CAF"/>
+    <w:nsid w:val="3D5F1823"/>
     <w:multiLevelType w:val="multilevel"/>
-    <w:tmpl w:val="48C05326"/>
+    <w:tmpl w:val="344EEA60"/>
     <w:lvl w:ilvl="0">
       <w:start w:val="1"/>
       <w:numFmt w:val="bullet"/>
@@ -9653,9 +10917,9 @@
     </w:lvl>
   </w:abstractNum>
   <w:abstractNum w:abstractNumId="4" w15:restartNumberingAfterBreak="0">
-    <w:nsid w:val="31C87FA4"/>
+    <w:nsid w:val="4F106659"/>
     <w:multiLevelType w:val="multilevel"/>
-    <w:tmpl w:val="5AFCE266"/>
+    <w:tmpl w:val="7B8649C8"/>
     <w:lvl w:ilvl="0">
       <w:start w:val="1"/>
       <w:numFmt w:val="bullet"/>
@@ -9802,9 +11066,9 @@
     </w:lvl>
   </w:abstractNum>
   <w:abstractNum w:abstractNumId="5" w15:restartNumberingAfterBreak="0">
-    <w:nsid w:val="41B62691"/>
+    <w:nsid w:val="5970728F"/>
     <w:multiLevelType w:val="multilevel"/>
-    <w:tmpl w:val="8BBC2AE8"/>
+    <w:tmpl w:val="1550F57E"/>
     <w:lvl w:ilvl="0">
       <w:start w:val="1"/>
       <w:numFmt w:val="bullet"/>
@@ -9951,9 +11215,9 @@
     </w:lvl>
   </w:abstractNum>
   <w:abstractNum w:abstractNumId="6" w15:restartNumberingAfterBreak="0">
-    <w:nsid w:val="44721943"/>
+    <w:nsid w:val="5A7219E4"/>
     <w:multiLevelType w:val="multilevel"/>
-    <w:tmpl w:val="995833A8"/>
+    <w:tmpl w:val="05B07D74"/>
     <w:lvl w:ilvl="0">
       <w:start w:val="1"/>
       <w:numFmt w:val="bullet"/>
@@ -10100,9 +11364,9 @@
     </w:lvl>
   </w:abstractNum>
   <w:abstractNum w:abstractNumId="7" w15:restartNumberingAfterBreak="0">
-    <w:nsid w:val="4B1C438E"/>
+    <w:nsid w:val="61DD34E9"/>
     <w:multiLevelType w:val="multilevel"/>
-    <w:tmpl w:val="C4B024C6"/>
+    <w:tmpl w:val="023ABB46"/>
     <w:lvl w:ilvl="0">
       <w:start w:val="1"/>
       <w:numFmt w:val="decimal"/>
@@ -10213,9 +11477,9 @@
     </w:lvl>
   </w:abstractNum>
   <w:abstractNum w:abstractNumId="8" w15:restartNumberingAfterBreak="0">
-    <w:nsid w:val="6D2318EB"/>
+    <w:nsid w:val="72DF30BA"/>
     <w:multiLevelType w:val="multilevel"/>
-    <w:tmpl w:val="6A94339E"/>
+    <w:tmpl w:val="1FFC7A6C"/>
     <w:lvl w:ilvl="0">
       <w:start w:val="1"/>
       <w:numFmt w:val="bullet"/>
@@ -10361,32 +11625,32 @@
       </w:rPr>
     </w:lvl>
   </w:abstractNum>
-  <w:num w:numId="1" w16cid:durableId="2056930501">
+  <w:num w:numId="1" w16cid:durableId="1353914563">
+    <w:abstractNumId w:val="5"/>
+  </w:num>
+  <w:num w:numId="2" w16cid:durableId="529800297">
+    <w:abstractNumId w:val="0"/>
+  </w:num>
+  <w:num w:numId="3" w16cid:durableId="2110812512">
+    <w:abstractNumId w:val="1"/>
+  </w:num>
+  <w:num w:numId="4" w16cid:durableId="16199320">
     <w:abstractNumId w:val="4"/>
   </w:num>
-  <w:num w:numId="2" w16cid:durableId="1483961255">
-    <w:abstractNumId w:val="1"/>
-  </w:num>
-  <w:num w:numId="3" w16cid:durableId="166140803">
-    <w:abstractNumId w:val="0"/>
-  </w:num>
-  <w:num w:numId="4" w16cid:durableId="373699592">
+  <w:num w:numId="5" w16cid:durableId="154805877">
     <w:abstractNumId w:val="3"/>
   </w:num>
-  <w:num w:numId="5" w16cid:durableId="335772624">
+  <w:num w:numId="6" w16cid:durableId="115101282">
+    <w:abstractNumId w:val="8"/>
+  </w:num>
+  <w:num w:numId="7" w16cid:durableId="1883856573">
+    <w:abstractNumId w:val="7"/>
+  </w:num>
+  <w:num w:numId="8" w16cid:durableId="782964965">
     <w:abstractNumId w:val="6"/>
   </w:num>
-  <w:num w:numId="6" w16cid:durableId="1156605701">
-    <w:abstractNumId w:val="5"/>
-  </w:num>
-  <w:num w:numId="7" w16cid:durableId="813060935">
+  <w:num w:numId="9" w16cid:durableId="920060447">
     <w:abstractNumId w:val="2"/>
-  </w:num>
-  <w:num w:numId="8" w16cid:durableId="1402555662">
-    <w:abstractNumId w:val="8"/>
-  </w:num>
-  <w:num w:numId="9" w16cid:durableId="60907910">
-    <w:abstractNumId w:val="7"/>
   </w:num>
 </w:numbering>
 </file>

</xml_diff>